<commit_message>
Add fine-tuned ViT small model weights for patch size 16 and resolution 224
</commit_message>
<xml_diff>
--- a/Odev3_Emirhan_AYDIN.docx
+++ b/Odev3_Emirhan_AYDIN.docx
@@ -7,9 +7,748 @@
         <w:pStyle w:val="Title"/>
       </w:pPr>
       <w:r>
-        <w:t>sa</w:t>
-      </w:r>
-    </w:p>
+        <w:t>VISION TRANSFORMER İLE GÖRÜNTÜ SINIFLANDIRMA</w:t>
+      </w:r>
+    </w:p>
+    <w:p>
+      <w:pPr>
+        <w:pStyle w:val="Title"/>
+      </w:pPr>
+    </w:p>
+    <w:p>
+      <w:pPr>
+        <w:pStyle w:val="Heading1"/>
+        <w:numPr>
+          <w:ilvl w:val="0"/>
+          <w:numId w:val="6"/>
+        </w:numPr>
+      </w:pPr>
+      <w:r>
+        <w:t>Veri Kümesi ve Model Seçimi</w:t>
+      </w:r>
+    </w:p>
+    <w:p>
+      <w:pPr>
+        <w:rPr>
+          <w:rFonts w:ascii="Times New Roman" w:hAnsi="Times New Roman"/>
+          <w:sz w:val="24"/>
+        </w:rPr>
+      </w:pPr>
+      <w:r>
+        <w:t>Bu çalışmada, ISIC 2019 veri kümesi kullanılmıştır. Veri kümesi, farklı deri lezyonlarını içeren çok sınıflı bir görüntü sınıflandırma problemidir. Veri seti eğitim (train) ve test olarak önceden ayrılmıştır ve bu ayrım korunarak model eğitimi gerçekleştirilmiştir.</w:t>
+      </w:r>
+    </w:p>
+    <w:p>
+      <w:r>
+        <w:t>Görüntüler, modelin gereksinimlerine uygun olacak şekilde 224×224 boyutuna yeniden ölçeklendirilmiştir. Veri artırma yöntemi olarak eğitim aşamasında rastgele yatay çevirme (RandomHorizontalFlip) uygulanmıştır. Ayrıca görüntüler, ImageNet veri setine ait ortalama ve standart sapma değerleri kullanılarak normalize edilmiştir.</w:t>
+      </w:r>
+    </w:p>
+    <w:p>
+      <w:r>
+        <w:t xml:space="preserve">Bu çalışmada </w:t>
+      </w:r>
+      <w:r>
+        <w:rPr>
+          <w:rStyle w:val="whitespace-normal"/>
+        </w:rPr>
+        <w:t>Vision Transformer (ViT)</w:t>
+      </w:r>
+      <w:r>
+        <w:t xml:space="preserve"> mimarisinin </w:t>
+      </w:r>
+      <w:r>
+        <w:rPr>
+          <w:rStyle w:val="Strong"/>
+        </w:rPr>
+        <w:t>ViT-Small (vit_small_patch16_224)</w:t>
+      </w:r>
+      <w:r>
+        <w:t xml:space="preserve"> varyantı kullanılmıştır. Bu model, doğruluk ve hesaplama maliyeti arasında dengeli bir performans sunduğu için tercih edilmiştir. Ayrıca kullanılan GPU kaynakları daha büyük modellerin eğitimini sınırlayabileceğinden bu seçim uygun görülmüştür.</w:t>
+      </w:r>
+    </w:p>
+    <w:p>
+      <w:r>
+        <w:t>Model, ImageNet üzerinde önceden eğitilmiş ağırlıklar ile başlatılmış ve veri kümesi üzerinde fine-tune edilmiştir. Sınıflandırma katmanı, veri kümesindeki sınıf sayısına uygun şekilde yeniden düzenlenmiştir.</w:t>
+      </w:r>
+    </w:p>
+    <w:p>
+      <w:pPr>
+        <w:pStyle w:val="Heading1"/>
+        <w:numPr>
+          <w:ilvl w:val="0"/>
+          <w:numId w:val="6"/>
+        </w:numPr>
+      </w:pPr>
+      <w:r>
+        <w:t>Eğitim ve Test Süreci</w:t>
+      </w:r>
+    </w:p>
+    <w:p>
+      <w:r>
+        <w:t>Model eğitimi sırasında batch size 32, learning rate 1e-4 ve weight decay 1e-4 olarak belirlenmiştir. Optimizasyon için AdamW algoritması kullanılmıştır. Öğrenme oranı, StepLR scheduler ile her 5 epoch'ta bir azaltılmıştır.</w:t>
+      </w:r>
+    </w:p>
+    <w:p>
+      <w:r>
+        <w:t>Model toplamda 10 epoch boyunca eğitilmiştir. Kayıp fonksiyonu olarak CrossEntropyLoss kullanılmıştır.</w:t>
+      </w:r>
+    </w:p>
+    <w:p>
+      <w:r>
+        <w:t>Bu çalışmada ayrı bir doğrulama veri seti bulunmadığı için doğrulama işlemleri test veri seti üzerinden gerçekleştirilmiştir.</w:t>
+      </w:r>
+    </w:p>
+    <w:p>
+      <w:r>
+        <w:drawing>
+          <wp:inline distT="0" distB="0" distL="0" distR="0" wp14:anchorId="50BF2406" wp14:editId="508BE479">
+            <wp:extent cx="5731510" cy="1910715"/>
+            <wp:effectExtent l="0" t="0" r="2540" b="0"/>
+            <wp:docPr id="1460893078" name="Picture 3"/>
+            <wp:cNvGraphicFramePr>
+              <a:graphicFrameLocks xmlns:a="http://schemas.openxmlformats.org/drawingml/2006/main" noChangeAspect="1"/>
+            </wp:cNvGraphicFramePr>
+            <a:graphic xmlns:a="http://schemas.openxmlformats.org/drawingml/2006/main">
+              <a:graphicData uri="http://schemas.openxmlformats.org/drawingml/2006/picture">
+                <pic:pic xmlns:pic="http://schemas.openxmlformats.org/drawingml/2006/picture">
+                  <pic:nvPicPr>
+                    <pic:cNvPr id="0" name="Picture 55"/>
+                    <pic:cNvPicPr>
+                      <a:picLocks noChangeAspect="1" noChangeArrowheads="1"/>
+                    </pic:cNvPicPr>
+                  </pic:nvPicPr>
+                  <pic:blipFill>
+                    <a:blip r:embed="rId5">
+                      <a:extLst>
+                        <a:ext uri="{28A0092B-C50C-407E-A947-70E740481C1C}">
+                          <a14:useLocalDpi xmlns:a14="http://schemas.microsoft.com/office/drawing/2010/main" val="0"/>
+                        </a:ext>
+                      </a:extLst>
+                    </a:blip>
+                    <a:srcRect/>
+                    <a:stretch>
+                      <a:fillRect/>
+                    </a:stretch>
+                  </pic:blipFill>
+                  <pic:spPr bwMode="auto">
+                    <a:xfrm>
+                      <a:off x="0" y="0"/>
+                      <a:ext cx="5731510" cy="1910715"/>
+                    </a:xfrm>
+                    <a:prstGeom prst="rect">
+                      <a:avLst/>
+                    </a:prstGeom>
+                    <a:noFill/>
+                    <a:ln>
+                      <a:noFill/>
+                    </a:ln>
+                  </pic:spPr>
+                </pic:pic>
+              </a:graphicData>
+            </a:graphic>
+          </wp:inline>
+        </w:drawing>
+      </w:r>
+    </w:p>
+    <w:p>
+      <w:r>
+        <w:t>Eğitim süreci incelendiğinde:</w:t>
+      </w:r>
+    </w:p>
+    <w:p>
+      <w:pPr>
+        <w:numPr>
+          <w:ilvl w:val="0"/>
+          <w:numId w:val="7"/>
+        </w:numPr>
+      </w:pPr>
+      <w:r>
+        <w:t xml:space="preserve">Eğitim loss değeri hızlı bir şekilde düşerek neredeyse sıfıra yaklaşmıştır. </w:t>
+      </w:r>
+    </w:p>
+    <w:p>
+      <w:pPr>
+        <w:numPr>
+          <w:ilvl w:val="0"/>
+          <w:numId w:val="7"/>
+        </w:numPr>
+      </w:pPr>
+      <w:r>
+        <w:t xml:space="preserve">Eğitim doğruluğu %100 seviyesine ulaşmıştır. </w:t>
+      </w:r>
+    </w:p>
+    <w:p>
+      <w:pPr>
+        <w:numPr>
+          <w:ilvl w:val="0"/>
+          <w:numId w:val="7"/>
+        </w:numPr>
+      </w:pPr>
+      <w:r>
+        <w:t xml:space="preserve">Ancak doğrulama (validation) loss değerinin belirli bir seviyeden sonra sabitlendiği gözlemlenmiştir. </w:t>
+      </w:r>
+    </w:p>
+    <w:p>
+      <w:r>
+        <w:lastRenderedPageBreak/>
+        <w:t>Bu durum, modelin eğitim verisini çok iyi öğrendiğini ancak genelleme (generalization) performansının sınırlı olduğunu göstermektedir.</w:t>
+      </w:r>
+    </w:p>
+    <w:p>
+      <w:pPr>
+        <w:pStyle w:val="Heading1"/>
+        <w:numPr>
+          <w:ilvl w:val="0"/>
+          <w:numId w:val="6"/>
+        </w:numPr>
+      </w:pPr>
+      <w:r>
+        <w:t>Test Sonuçları</w:t>
+      </w:r>
+    </w:p>
+    <w:p>
+      <w:r>
+        <w:t>Test veri seti üzerinde elde edilen performans metrikleri aşağıda verilmiştir:</w:t>
+      </w:r>
+    </w:p>
+    <w:p>
+      <w:pPr>
+        <w:numPr>
+          <w:ilvl w:val="0"/>
+          <w:numId w:val="8"/>
+        </w:numPr>
+      </w:pPr>
+      <w:r>
+        <w:t xml:space="preserve">Accuracy: </w:t>
+      </w:r>
+      <w:r>
+        <w:rPr>
+          <w:b/>
+          <w:bCs/>
+        </w:rPr>
+        <w:t>0.8850</w:t>
+      </w:r>
+      <w:r>
+        <w:t xml:space="preserve"> </w:t>
+      </w:r>
+    </w:p>
+    <w:p>
+      <w:pPr>
+        <w:numPr>
+          <w:ilvl w:val="0"/>
+          <w:numId w:val="8"/>
+        </w:numPr>
+      </w:pPr>
+      <w:r>
+        <w:t xml:space="preserve">Precision (macro): </w:t>
+      </w:r>
+      <w:r>
+        <w:rPr>
+          <w:b/>
+          <w:bCs/>
+        </w:rPr>
+        <w:t>0.8847</w:t>
+      </w:r>
+      <w:r>
+        <w:t xml:space="preserve"> </w:t>
+      </w:r>
+    </w:p>
+    <w:p>
+      <w:pPr>
+        <w:numPr>
+          <w:ilvl w:val="0"/>
+          <w:numId w:val="8"/>
+        </w:numPr>
+      </w:pPr>
+      <w:r>
+        <w:t xml:space="preserve">Recall (macro): </w:t>
+      </w:r>
+      <w:r>
+        <w:rPr>
+          <w:b/>
+          <w:bCs/>
+        </w:rPr>
+        <w:t>0.8850</w:t>
+      </w:r>
+      <w:r>
+        <w:t xml:space="preserve"> </w:t>
+      </w:r>
+    </w:p>
+    <w:p>
+      <w:pPr>
+        <w:numPr>
+          <w:ilvl w:val="0"/>
+          <w:numId w:val="8"/>
+        </w:numPr>
+      </w:pPr>
+      <w:r>
+        <w:t xml:space="preserve">F1-score (macro): </w:t>
+      </w:r>
+      <w:r>
+        <w:rPr>
+          <w:b/>
+          <w:bCs/>
+        </w:rPr>
+        <w:t>0.8847</w:t>
+      </w:r>
+      <w:r>
+        <w:t xml:space="preserve"> </w:t>
+      </w:r>
+    </w:p>
+    <w:p>
+      <w:r>
+        <w:t>Model performansını daha detaylı incelemek için confusion matrix oluşturulmuştur.</w:t>
+      </w:r>
+    </w:p>
+    <w:p>
+      <w:r>
+        <w:rPr>
+          <w:noProof/>
+        </w:rPr>
+        <w:drawing>
+          <wp:inline distT="0" distB="0" distL="0" distR="0" wp14:anchorId="60B60D14" wp14:editId="4320A37D">
+            <wp:extent cx="5724525" cy="4295775"/>
+            <wp:effectExtent l="0" t="0" r="9525" b="9525"/>
+            <wp:docPr id="1491471619" name="Picture 1"/>
+            <wp:cNvGraphicFramePr>
+              <a:graphicFrameLocks xmlns:a="http://schemas.openxmlformats.org/drawingml/2006/main" noChangeAspect="1"/>
+            </wp:cNvGraphicFramePr>
+            <a:graphic xmlns:a="http://schemas.openxmlformats.org/drawingml/2006/main">
+              <a:graphicData uri="http://schemas.openxmlformats.org/drawingml/2006/picture">
+                <pic:pic xmlns:pic="http://schemas.openxmlformats.org/drawingml/2006/picture">
+                  <pic:nvPicPr>
+                    <pic:cNvPr id="0" name="Picture 49"/>
+                    <pic:cNvPicPr>
+                      <a:picLocks noChangeAspect="1" noChangeArrowheads="1"/>
+                    </pic:cNvPicPr>
+                  </pic:nvPicPr>
+                  <pic:blipFill>
+                    <a:blip r:embed="rId6">
+                      <a:extLst>
+                        <a:ext uri="{28A0092B-C50C-407E-A947-70E740481C1C}">
+                          <a14:useLocalDpi xmlns:a14="http://schemas.microsoft.com/office/drawing/2010/main" val="0"/>
+                        </a:ext>
+                      </a:extLst>
+                    </a:blip>
+                    <a:srcRect/>
+                    <a:stretch>
+                      <a:fillRect/>
+                    </a:stretch>
+                  </pic:blipFill>
+                  <pic:spPr bwMode="auto">
+                    <a:xfrm>
+                      <a:off x="0" y="0"/>
+                      <a:ext cx="5724525" cy="4295775"/>
+                    </a:xfrm>
+                    <a:prstGeom prst="rect">
+                      <a:avLst/>
+                    </a:prstGeom>
+                    <a:noFill/>
+                    <a:ln>
+                      <a:noFill/>
+                    </a:ln>
+                  </pic:spPr>
+                </pic:pic>
+              </a:graphicData>
+            </a:graphic>
+          </wp:inline>
+        </w:drawing>
+      </w:r>
+    </w:p>
+    <w:p>
+      <w:r>
+        <w:t>Confusion matrix incelendiğinde:</w:t>
+      </w:r>
+    </w:p>
+    <w:p>
+      <w:pPr>
+        <w:numPr>
+          <w:ilvl w:val="0"/>
+          <w:numId w:val="9"/>
+        </w:numPr>
+      </w:pPr>
+      <w:r>
+        <w:t xml:space="preserve">Bazı sınıfların (örneğin DF ve VASC) çok yüksek doğrulukla sınıflandırıldığı, </w:t>
+      </w:r>
+    </w:p>
+    <w:p>
+      <w:pPr>
+        <w:numPr>
+          <w:ilvl w:val="0"/>
+          <w:numId w:val="9"/>
+        </w:numPr>
+      </w:pPr>
+      <w:r>
+        <w:t xml:space="preserve">Ancak bazı sınıflar arasında (örneğin MEL ve NV) karışmalar olduğu gözlemlenmiştir. </w:t>
+      </w:r>
+    </w:p>
+    <w:p>
+      <w:r>
+        <w:t>Bu durum, veri kümesindeki bazı sınıfların görsel olarak birbirine benzer olmasından kaynaklanabilir.</w:t>
+      </w:r>
+    </w:p>
+    <w:p>
+      <w:pPr>
+        <w:spacing w:before="0" w:after="160" w:line="278" w:lineRule="auto"/>
+        <w:jc w:val="left"/>
+      </w:pPr>
+      <w:r>
+        <w:br w:type="page"/>
+      </w:r>
+    </w:p>
+    <w:p>
+      <w:pPr>
+        <w:pStyle w:val="Heading1"/>
+        <w:numPr>
+          <w:ilvl w:val="0"/>
+          <w:numId w:val="6"/>
+        </w:numPr>
+      </w:pPr>
+      <w:r>
+        <w:lastRenderedPageBreak/>
+        <w:t>C</w:t>
+      </w:r>
+      <w:r>
+        <w:t>NN ile Karşılaştırma</w:t>
+      </w:r>
+    </w:p>
+    <w:tbl>
+      <w:tblPr>
+        <w:tblStyle w:val="PlainTable1"/>
+        <w:tblW w:w="0" w:type="auto"/>
+        <w:tblLook w:val="04A0" w:firstRow="1" w:lastRow="0" w:firstColumn="1" w:lastColumn="0" w:noHBand="0" w:noVBand="1"/>
+      </w:tblPr>
+      <w:tblGrid>
+        <w:gridCol w:w="3005"/>
+        <w:gridCol w:w="3005"/>
+        <w:gridCol w:w="3006"/>
+      </w:tblGrid>
+      <w:tr>
+        <w:trPr>
+          <w:cnfStyle w:val="100000000000" w:firstRow="1" w:lastRow="0" w:firstColumn="0" w:lastColumn="0" w:oddVBand="0" w:evenVBand="0" w:oddHBand="0" w:evenHBand="0" w:firstRowFirstColumn="0" w:firstRowLastColumn="0" w:lastRowFirstColumn="0" w:lastRowLastColumn="0"/>
+        </w:trPr>
+        <w:tc>
+          <w:tcPr>
+            <w:cnfStyle w:val="001000000000" w:firstRow="0" w:lastRow="0" w:firstColumn="1" w:lastColumn="0" w:oddVBand="0" w:evenVBand="0" w:oddHBand="0" w:evenHBand="0" w:firstRowFirstColumn="0" w:firstRowLastColumn="0" w:lastRowFirstColumn="0" w:lastRowLastColumn="0"/>
+            <w:tcW w:w="3005" w:type="dxa"/>
+          </w:tcPr>
+          <w:p>
+            <w:r>
+              <w:t>Metrik</w:t>
+            </w:r>
+          </w:p>
+        </w:tc>
+        <w:tc>
+          <w:tcPr>
+            <w:tcW w:w="3005" w:type="dxa"/>
+          </w:tcPr>
+          <w:p>
+            <w:pPr>
+              <w:cnfStyle w:val="100000000000" w:firstRow="1" w:lastRow="0" w:firstColumn="0" w:lastColumn="0" w:oddVBand="0" w:evenVBand="0" w:oddHBand="0" w:evenHBand="0" w:firstRowFirstColumn="0" w:firstRowLastColumn="0" w:lastRowFirstColumn="0" w:lastRowLastColumn="0"/>
+            </w:pPr>
+            <w:r>
+              <w:t>CNN (Ödev 2)</w:t>
+            </w:r>
+          </w:p>
+        </w:tc>
+        <w:tc>
+          <w:tcPr>
+            <w:tcW w:w="3006" w:type="dxa"/>
+          </w:tcPr>
+          <w:p>
+            <w:pPr>
+              <w:cnfStyle w:val="100000000000" w:firstRow="1" w:lastRow="0" w:firstColumn="0" w:lastColumn="0" w:oddVBand="0" w:evenVBand="0" w:oddHBand="0" w:evenHBand="0" w:firstRowFirstColumn="0" w:firstRowLastColumn="0" w:lastRowFirstColumn="0" w:lastRowLastColumn="0"/>
+            </w:pPr>
+            <w:r>
+              <w:t>ViT</w:t>
+            </w:r>
+          </w:p>
+        </w:tc>
+      </w:tr>
+      <w:tr>
+        <w:trPr>
+          <w:cnfStyle w:val="000000100000" w:firstRow="0" w:lastRow="0" w:firstColumn="0" w:lastColumn="0" w:oddVBand="0" w:evenVBand="0" w:oddHBand="1" w:evenHBand="0" w:firstRowFirstColumn="0" w:firstRowLastColumn="0" w:lastRowFirstColumn="0" w:lastRowLastColumn="0"/>
+        </w:trPr>
+        <w:tc>
+          <w:tcPr>
+            <w:cnfStyle w:val="001000000000" w:firstRow="0" w:lastRow="0" w:firstColumn="1" w:lastColumn="0" w:oddVBand="0" w:evenVBand="0" w:oddHBand="0" w:evenHBand="0" w:firstRowFirstColumn="0" w:firstRowLastColumn="0" w:lastRowFirstColumn="0" w:lastRowLastColumn="0"/>
+            <w:tcW w:w="3005" w:type="dxa"/>
+          </w:tcPr>
+          <w:p>
+            <w:r>
+              <w:t>Accuracy</w:t>
+            </w:r>
+          </w:p>
+        </w:tc>
+        <w:tc>
+          <w:tcPr>
+            <w:tcW w:w="3005" w:type="dxa"/>
+          </w:tcPr>
+          <w:p>
+            <w:pPr>
+              <w:cnfStyle w:val="000000100000" w:firstRow="0" w:lastRow="0" w:firstColumn="0" w:lastColumn="0" w:oddVBand="0" w:evenVBand="0" w:oddHBand="1" w:evenHBand="0" w:firstRowFirstColumn="0" w:firstRowLastColumn="0" w:lastRowFirstColumn="0" w:lastRowLastColumn="0"/>
+            </w:pPr>
+            <w:r>
+              <w:t>0.781</w:t>
+            </w:r>
+          </w:p>
+        </w:tc>
+        <w:tc>
+          <w:tcPr>
+            <w:tcW w:w="3006" w:type="dxa"/>
+          </w:tcPr>
+          <w:p>
+            <w:pPr>
+              <w:cnfStyle w:val="000000100000" w:firstRow="0" w:lastRow="0" w:firstColumn="0" w:lastColumn="0" w:oddVBand="0" w:evenVBand="0" w:oddHBand="1" w:evenHBand="0" w:firstRowFirstColumn="0" w:firstRowLastColumn="0" w:lastRowFirstColumn="0" w:lastRowLastColumn="0"/>
+            </w:pPr>
+            <w:r>
+              <w:t>0.885</w:t>
+            </w:r>
+          </w:p>
+        </w:tc>
+      </w:tr>
+      <w:tr>
+        <w:tc>
+          <w:tcPr>
+            <w:cnfStyle w:val="001000000000" w:firstRow="0" w:lastRow="0" w:firstColumn="1" w:lastColumn="0" w:oddVBand="0" w:evenVBand="0" w:oddHBand="0" w:evenHBand="0" w:firstRowFirstColumn="0" w:firstRowLastColumn="0" w:lastRowFirstColumn="0" w:lastRowLastColumn="0"/>
+            <w:tcW w:w="3005" w:type="dxa"/>
+          </w:tcPr>
+          <w:p>
+            <w:r>
+              <w:t>Precision</w:t>
+            </w:r>
+          </w:p>
+        </w:tc>
+        <w:tc>
+          <w:tcPr>
+            <w:tcW w:w="3005" w:type="dxa"/>
+          </w:tcPr>
+          <w:p>
+            <w:pPr>
+              <w:cnfStyle w:val="000000000000" w:firstRow="0" w:lastRow="0" w:firstColumn="0" w:lastColumn="0" w:oddVBand="0" w:evenVBand="0" w:oddHBand="0" w:evenHBand="0" w:firstRowFirstColumn="0" w:firstRowLastColumn="0" w:lastRowFirstColumn="0" w:lastRowLastColumn="0"/>
+            </w:pPr>
+            <w:r>
+              <w:t>0.788</w:t>
+            </w:r>
+          </w:p>
+        </w:tc>
+        <w:tc>
+          <w:tcPr>
+            <w:tcW w:w="3006" w:type="dxa"/>
+          </w:tcPr>
+          <w:p>
+            <w:pPr>
+              <w:cnfStyle w:val="000000000000" w:firstRow="0" w:lastRow="0" w:firstColumn="0" w:lastColumn="0" w:oddVBand="0" w:evenVBand="0" w:oddHBand="0" w:evenHBand="0" w:firstRowFirstColumn="0" w:firstRowLastColumn="0" w:lastRowFirstColumn="0" w:lastRowLastColumn="0"/>
+            </w:pPr>
+            <w:r>
+              <w:t>0.8847</w:t>
+            </w:r>
+          </w:p>
+        </w:tc>
+      </w:tr>
+      <w:tr>
+        <w:trPr>
+          <w:cnfStyle w:val="000000100000" w:firstRow="0" w:lastRow="0" w:firstColumn="0" w:lastColumn="0" w:oddVBand="0" w:evenVBand="0" w:oddHBand="1" w:evenHBand="0" w:firstRowFirstColumn="0" w:firstRowLastColumn="0" w:lastRowFirstColumn="0" w:lastRowLastColumn="0"/>
+        </w:trPr>
+        <w:tc>
+          <w:tcPr>
+            <w:cnfStyle w:val="001000000000" w:firstRow="0" w:lastRow="0" w:firstColumn="1" w:lastColumn="0" w:oddVBand="0" w:evenVBand="0" w:oddHBand="0" w:evenHBand="0" w:firstRowFirstColumn="0" w:firstRowLastColumn="0" w:lastRowFirstColumn="0" w:lastRowLastColumn="0"/>
+            <w:tcW w:w="3005" w:type="dxa"/>
+          </w:tcPr>
+          <w:p>
+            <w:r>
+              <w:t>Recall</w:t>
+            </w:r>
+          </w:p>
+        </w:tc>
+        <w:tc>
+          <w:tcPr>
+            <w:tcW w:w="3005" w:type="dxa"/>
+          </w:tcPr>
+          <w:p>
+            <w:pPr>
+              <w:cnfStyle w:val="000000100000" w:firstRow="0" w:lastRow="0" w:firstColumn="0" w:lastColumn="0" w:oddVBand="0" w:evenVBand="0" w:oddHBand="1" w:evenHBand="0" w:firstRowFirstColumn="0" w:firstRowLastColumn="0" w:lastRowFirstColumn="0" w:lastRowLastColumn="0"/>
+            </w:pPr>
+            <w:r>
+              <w:t>0.781</w:t>
+            </w:r>
+          </w:p>
+        </w:tc>
+        <w:tc>
+          <w:tcPr>
+            <w:tcW w:w="3006" w:type="dxa"/>
+          </w:tcPr>
+          <w:p>
+            <w:pPr>
+              <w:cnfStyle w:val="000000100000" w:firstRow="0" w:lastRow="0" w:firstColumn="0" w:lastColumn="0" w:oddVBand="0" w:evenVBand="0" w:oddHBand="1" w:evenHBand="0" w:firstRowFirstColumn="0" w:firstRowLastColumn="0" w:lastRowFirstColumn="0" w:lastRowLastColumn="0"/>
+            </w:pPr>
+            <w:r>
+              <w:t>0.885</w:t>
+            </w:r>
+          </w:p>
+        </w:tc>
+      </w:tr>
+      <w:tr>
+        <w:tc>
+          <w:tcPr>
+            <w:cnfStyle w:val="001000000000" w:firstRow="0" w:lastRow="0" w:firstColumn="1" w:lastColumn="0" w:oddVBand="0" w:evenVBand="0" w:oddHBand="0" w:evenHBand="0" w:firstRowFirstColumn="0" w:firstRowLastColumn="0" w:lastRowFirstColumn="0" w:lastRowLastColumn="0"/>
+            <w:tcW w:w="3005" w:type="dxa"/>
+          </w:tcPr>
+          <w:p>
+            <w:r>
+              <w:t>F1-Score</w:t>
+            </w:r>
+          </w:p>
+        </w:tc>
+        <w:tc>
+          <w:tcPr>
+            <w:tcW w:w="3005" w:type="dxa"/>
+          </w:tcPr>
+          <w:p>
+            <w:pPr>
+              <w:cnfStyle w:val="000000000000" w:firstRow="0" w:lastRow="0" w:firstColumn="0" w:lastColumn="0" w:oddVBand="0" w:evenVBand="0" w:oddHBand="0" w:evenHBand="0" w:firstRowFirstColumn="0" w:firstRowLastColumn="0" w:lastRowFirstColumn="0" w:lastRowLastColumn="0"/>
+            </w:pPr>
+            <w:r>
+              <w:t>0.775</w:t>
+            </w:r>
+          </w:p>
+        </w:tc>
+        <w:tc>
+          <w:tcPr>
+            <w:tcW w:w="3006" w:type="dxa"/>
+          </w:tcPr>
+          <w:p>
+            <w:pPr>
+              <w:cnfStyle w:val="000000000000" w:firstRow="0" w:lastRow="0" w:firstColumn="0" w:lastColumn="0" w:oddVBand="0" w:evenVBand="0" w:oddHBand="0" w:evenHBand="0" w:firstRowFirstColumn="0" w:firstRowLastColumn="0" w:lastRowFirstColumn="0" w:lastRowLastColumn="0"/>
+            </w:pPr>
+            <w:r>
+              <w:t>0.8847</w:t>
+            </w:r>
+          </w:p>
+        </w:tc>
+      </w:tr>
+      <w:tr>
+        <w:trPr>
+          <w:cnfStyle w:val="000000100000" w:firstRow="0" w:lastRow="0" w:firstColumn="0" w:lastColumn="0" w:oddVBand="0" w:evenVBand="0" w:oddHBand="1" w:evenHBand="0" w:firstRowFirstColumn="0" w:firstRowLastColumn="0" w:lastRowFirstColumn="0" w:lastRowLastColumn="0"/>
+        </w:trPr>
+        <w:tc>
+          <w:tcPr>
+            <w:cnfStyle w:val="001000000000" w:firstRow="0" w:lastRow="0" w:firstColumn="1" w:lastColumn="0" w:oddVBand="0" w:evenVBand="0" w:oddHBand="0" w:evenHBand="0" w:firstRowFirstColumn="0" w:firstRowLastColumn="0" w:lastRowFirstColumn="0" w:lastRowLastColumn="0"/>
+            <w:tcW w:w="3005" w:type="dxa"/>
+          </w:tcPr>
+          <w:p>
+            <w:r>
+              <w:t>Eğitim Süresi</w:t>
+            </w:r>
+            <w:r>
+              <w:t xml:space="preserve"> </w:t>
+            </w:r>
+            <w:r>
+              <w:t>(</w:t>
+            </w:r>
+            <w:r>
+              <w:t>sa:dk:s</w:t>
+            </w:r>
+            <w:r>
+              <w:t>)</w:t>
+            </w:r>
+          </w:p>
+        </w:tc>
+        <w:tc>
+          <w:tcPr>
+            <w:tcW w:w="3005" w:type="dxa"/>
+          </w:tcPr>
+          <w:p>
+            <w:pPr>
+              <w:cnfStyle w:val="000000100000" w:firstRow="0" w:lastRow="0" w:firstColumn="0" w:lastColumn="0" w:oddVBand="0" w:evenVBand="0" w:oddHBand="1" w:evenHBand="0" w:firstRowFirstColumn="0" w:firstRowLastColumn="0" w:lastRowFirstColumn="0" w:lastRowLastColumn="0"/>
+            </w:pPr>
+            <w:r>
+              <w:t>05:59:13</w:t>
+            </w:r>
+          </w:p>
+        </w:tc>
+        <w:tc>
+          <w:tcPr>
+            <w:tcW w:w="3006" w:type="dxa"/>
+          </w:tcPr>
+          <w:p>
+            <w:pPr>
+              <w:cnfStyle w:val="000000100000" w:firstRow="0" w:lastRow="0" w:firstColumn="0" w:lastColumn="0" w:oddVBand="0" w:evenVBand="0" w:oddHBand="1" w:evenHBand="0" w:firstRowFirstColumn="0" w:firstRowLastColumn="0" w:lastRowFirstColumn="0" w:lastRowLastColumn="0"/>
+            </w:pPr>
+            <w:r>
+              <w:t>00:13:30</w:t>
+            </w:r>
+          </w:p>
+        </w:tc>
+      </w:tr>
+    </w:tbl>
+    <w:p/>
+    <w:p>
+      <w:pPr>
+        <w:pStyle w:val="Heading1"/>
+        <w:numPr>
+          <w:ilvl w:val="0"/>
+          <w:numId w:val="6"/>
+        </w:numPr>
+      </w:pPr>
+      <w:r>
+        <w:t>Yorum</w:t>
+      </w:r>
+    </w:p>
+    <w:p>
+      <w:r>
+        <w:t>Bu çalışmada Vision Transformer modeli ile görüntü sınıflandırma performansı incelenmiştir.</w:t>
+      </w:r>
+    </w:p>
+    <w:p>
+      <w:r>
+        <w:t>Elde edilen sonuçlara göre model, eğitim verisi üzerinde çok yüksek doğruluk elde etmiş olmasına rağmen test performansı %88.5 seviyesinde kalmıştır. Bu durum, modelin overfitting (aşırı öğrenme) eğilimi gösterdiğini ortaya koymaktadır.</w:t>
+      </w:r>
+    </w:p>
+    <w:p>
+      <w:r>
+        <w:t>Vision Transformer modelleri, CNN modellere kıyasla daha fazla parametre içerir ve genellikle daha büyük veri kümelerinde daha başarılı sonuçlar verir. Bu çalışmada kullanılan veri kümesinin boyutu, modelin tam potansiyelini ortaya koymak için yeterli olmayabilir.</w:t>
+      </w:r>
+    </w:p>
+    <w:p>
+      <w:r>
+        <w:t>Ayrıca transformer mimarisi, global ilişkileri öğrenme konusunda avantajlı olsa da, sınırlı veri durumunda bu avantaj tam olarak kullanılamayabilir.</w:t>
+      </w:r>
+    </w:p>
+    <w:p>
+      <w:r>
+        <w:t>Genel olarak:</w:t>
+      </w:r>
+    </w:p>
+    <w:p>
+      <w:pPr>
+        <w:numPr>
+          <w:ilvl w:val="0"/>
+          <w:numId w:val="10"/>
+        </w:numPr>
+      </w:pPr>
+      <w:r>
+        <w:t>ViT modeli</w:t>
+      </w:r>
+      <w:r>
+        <w:t xml:space="preserve"> CNN’e göre</w:t>
+      </w:r>
+      <w:r>
+        <w:t xml:space="preserve"> güçlü bir performans göstermiştir </w:t>
+      </w:r>
+    </w:p>
+    <w:p>
+      <w:pPr>
+        <w:numPr>
+          <w:ilvl w:val="0"/>
+          <w:numId w:val="10"/>
+        </w:numPr>
+      </w:pPr>
+      <w:r>
+        <w:t>Ancak veri miktarı ve eğitim stratejisi artırıldığında daha iyi sonuçlar elde edilebilir</w:t>
+      </w:r>
+    </w:p>
+    <w:p/>
     <w:sectPr>
       <w:pgSz w:w="11906" w:h="16838"/>
       <w:pgMar w:top="1440" w:right="1440" w:bottom="1440" w:left="1440" w:header="708" w:footer="708" w:gutter="0"/>
@@ -18,6 +757,1436 @@
     </w:sectPr>
   </w:body>
 </w:document>
+</file>
+
+<file path=word/numbering.xml><?xml version="1.0" encoding="utf-8"?>
+<w:numbering xmlns:wpc="http://schemas.microsoft.com/office/word/2010/wordprocessingCanvas" xmlns:cx="http://schemas.microsoft.com/office/drawing/2014/chartex" xmlns:cx1="http://schemas.microsoft.com/office/drawing/2015/9/8/chartex" xmlns:cx2="http://schemas.microsoft.com/office/drawing/2015/10/21/chartex" xmlns:cx3="http://schemas.microsoft.com/office/drawing/2016/5/9/chartex" xmlns:cx4="http://schemas.microsoft.com/office/drawing/2016/5/10/chartex" xmlns:cx5="http://schemas.microsoft.com/office/drawing/2016/5/11/chartex" xmlns:cx6="http://schemas.microsoft.com/office/drawing/2016/5/12/chartex" xmlns:cx7="http://schemas.microsoft.com/office/drawing/2016/5/13/chartex" xmlns:cx8="http://schemas.microsoft.com/office/drawing/2016/5/14/chartex" xmlns:mc="http://schemas.openxmlformats.org/markup-compatibility/2006" xmlns:aink="http://schemas.microsoft.com/office/drawing/2016/ink" xmlns:am3d="http://schemas.microsoft.com/office/drawing/2017/model3d" xmlns:o="urn:schemas-microsoft-com:office:office" xmlns:oel="http://schemas.microsoft.com/office/2019/extlst" xmlns:r="http://schemas.openxmlformats.org/officeDocument/2006/relationships" xmlns:m="http://schemas.openxmlformats.org/officeDocument/2006/math" xmlns:v="urn:schemas-microsoft-com:vml" xmlns:wp14="http://schemas.microsoft.com/office/word/2010/wordprocessingDrawing" xmlns:wp="http://schemas.openxmlformats.org/drawingml/2006/wordprocessingDrawing" xmlns:w10="urn:schemas-microsoft-com:office:word" xmlns:w="http://schemas.openxmlformats.org/wordprocessingml/2006/main" xmlns:w14="http://schemas.microsoft.com/office/word/2010/wordml" xmlns:w15="http://schemas.microsoft.com/office/word/2012/wordml" xmlns:w16cex="http://schemas.microsoft.com/office/word/2018/wordml/cex" xmlns:w16cid="http://schemas.microsoft.com/office/word/2016/wordml/cid" xmlns:w16="http://schemas.microsoft.com/office/word/2018/wordml" xmlns:w16du="http://schemas.microsoft.com/office/word/2023/wordml/word16du" xmlns:w16sdtdh="http://schemas.microsoft.com/office/word/2020/wordml/sdtdatahash" xmlns:w16sdtfl="http://schemas.microsoft.com/office/word/2024/wordml/sdtformatlock" xmlns:w16se="http://schemas.microsoft.com/office/word/2015/wordml/symex" xmlns:wpg="http://schemas.microsoft.com/office/word/2010/wordprocessingGroup" xmlns:wpi="http://schemas.microsoft.com/office/word/2010/wordprocessingInk" xmlns:wne="http://schemas.microsoft.com/office/word/2006/wordml" xmlns:wps="http://schemas.microsoft.com/office/word/2010/wordprocessingShape" mc:Ignorable="w14 w15 w16se w16cid w16 w16cex w16sdtdh w16sdtfl w16du wp14">
+  <w:abstractNum w:abstractNumId="0" w15:restartNumberingAfterBreak="0">
+    <w:nsid w:val="01D57877"/>
+    <w:multiLevelType w:val="multilevel"/>
+    <w:tmpl w:val="92F06C9E"/>
+    <w:lvl w:ilvl="0">
+      <w:start w:val="1"/>
+      <w:numFmt w:val="bullet"/>
+      <w:lvlText w:val=""/>
+      <w:lvlJc w:val="left"/>
+      <w:pPr>
+        <w:tabs>
+          <w:tab w:val="num" w:pos="720"/>
+        </w:tabs>
+        <w:ind w:left="720" w:hanging="360"/>
+      </w:pPr>
+      <w:rPr>
+        <w:rFonts w:ascii="Symbol" w:hAnsi="Symbol" w:hint="default"/>
+        <w:sz w:val="20"/>
+      </w:rPr>
+    </w:lvl>
+    <w:lvl w:ilvl="1" w:tentative="1">
+      <w:start w:val="1"/>
+      <w:numFmt w:val="bullet"/>
+      <w:lvlText w:val="o"/>
+      <w:lvlJc w:val="left"/>
+      <w:pPr>
+        <w:tabs>
+          <w:tab w:val="num" w:pos="1440"/>
+        </w:tabs>
+        <w:ind w:left="1440" w:hanging="360"/>
+      </w:pPr>
+      <w:rPr>
+        <w:rFonts w:ascii="Courier New" w:hAnsi="Courier New" w:hint="default"/>
+        <w:sz w:val="20"/>
+      </w:rPr>
+    </w:lvl>
+    <w:lvl w:ilvl="2" w:tentative="1">
+      <w:start w:val="1"/>
+      <w:numFmt w:val="bullet"/>
+      <w:lvlText w:val=""/>
+      <w:lvlJc w:val="left"/>
+      <w:pPr>
+        <w:tabs>
+          <w:tab w:val="num" w:pos="2160"/>
+        </w:tabs>
+        <w:ind w:left="2160" w:hanging="360"/>
+      </w:pPr>
+      <w:rPr>
+        <w:rFonts w:ascii="Wingdings" w:hAnsi="Wingdings" w:hint="default"/>
+        <w:sz w:val="20"/>
+      </w:rPr>
+    </w:lvl>
+    <w:lvl w:ilvl="3" w:tentative="1">
+      <w:start w:val="1"/>
+      <w:numFmt w:val="bullet"/>
+      <w:lvlText w:val=""/>
+      <w:lvlJc w:val="left"/>
+      <w:pPr>
+        <w:tabs>
+          <w:tab w:val="num" w:pos="2880"/>
+        </w:tabs>
+        <w:ind w:left="2880" w:hanging="360"/>
+      </w:pPr>
+      <w:rPr>
+        <w:rFonts w:ascii="Wingdings" w:hAnsi="Wingdings" w:hint="default"/>
+        <w:sz w:val="20"/>
+      </w:rPr>
+    </w:lvl>
+    <w:lvl w:ilvl="4" w:tentative="1">
+      <w:start w:val="1"/>
+      <w:numFmt w:val="bullet"/>
+      <w:lvlText w:val=""/>
+      <w:lvlJc w:val="left"/>
+      <w:pPr>
+        <w:tabs>
+          <w:tab w:val="num" w:pos="3600"/>
+        </w:tabs>
+        <w:ind w:left="3600" w:hanging="360"/>
+      </w:pPr>
+      <w:rPr>
+        <w:rFonts w:ascii="Wingdings" w:hAnsi="Wingdings" w:hint="default"/>
+        <w:sz w:val="20"/>
+      </w:rPr>
+    </w:lvl>
+    <w:lvl w:ilvl="5" w:tentative="1">
+      <w:start w:val="1"/>
+      <w:numFmt w:val="bullet"/>
+      <w:lvlText w:val=""/>
+      <w:lvlJc w:val="left"/>
+      <w:pPr>
+        <w:tabs>
+          <w:tab w:val="num" w:pos="4320"/>
+        </w:tabs>
+        <w:ind w:left="4320" w:hanging="360"/>
+      </w:pPr>
+      <w:rPr>
+        <w:rFonts w:ascii="Wingdings" w:hAnsi="Wingdings" w:hint="default"/>
+        <w:sz w:val="20"/>
+      </w:rPr>
+    </w:lvl>
+    <w:lvl w:ilvl="6" w:tentative="1">
+      <w:start w:val="1"/>
+      <w:numFmt w:val="bullet"/>
+      <w:lvlText w:val=""/>
+      <w:lvlJc w:val="left"/>
+      <w:pPr>
+        <w:tabs>
+          <w:tab w:val="num" w:pos="5040"/>
+        </w:tabs>
+        <w:ind w:left="5040" w:hanging="360"/>
+      </w:pPr>
+      <w:rPr>
+        <w:rFonts w:ascii="Wingdings" w:hAnsi="Wingdings" w:hint="default"/>
+        <w:sz w:val="20"/>
+      </w:rPr>
+    </w:lvl>
+    <w:lvl w:ilvl="7" w:tentative="1">
+      <w:start w:val="1"/>
+      <w:numFmt w:val="bullet"/>
+      <w:lvlText w:val=""/>
+      <w:lvlJc w:val="left"/>
+      <w:pPr>
+        <w:tabs>
+          <w:tab w:val="num" w:pos="5760"/>
+        </w:tabs>
+        <w:ind w:left="5760" w:hanging="360"/>
+      </w:pPr>
+      <w:rPr>
+        <w:rFonts w:ascii="Wingdings" w:hAnsi="Wingdings" w:hint="default"/>
+        <w:sz w:val="20"/>
+      </w:rPr>
+    </w:lvl>
+    <w:lvl w:ilvl="8" w:tentative="1">
+      <w:start w:val="1"/>
+      <w:numFmt w:val="bullet"/>
+      <w:lvlText w:val=""/>
+      <w:lvlJc w:val="left"/>
+      <w:pPr>
+        <w:tabs>
+          <w:tab w:val="num" w:pos="6480"/>
+        </w:tabs>
+        <w:ind w:left="6480" w:hanging="360"/>
+      </w:pPr>
+      <w:rPr>
+        <w:rFonts w:ascii="Wingdings" w:hAnsi="Wingdings" w:hint="default"/>
+        <w:sz w:val="20"/>
+      </w:rPr>
+    </w:lvl>
+  </w:abstractNum>
+  <w:abstractNum w:abstractNumId="1" w15:restartNumberingAfterBreak="0">
+    <w:nsid w:val="03242338"/>
+    <w:multiLevelType w:val="multilevel"/>
+    <w:tmpl w:val="A87C24CE"/>
+    <w:lvl w:ilvl="0">
+      <w:start w:val="1"/>
+      <w:numFmt w:val="bullet"/>
+      <w:lvlText w:val=""/>
+      <w:lvlJc w:val="left"/>
+      <w:pPr>
+        <w:tabs>
+          <w:tab w:val="num" w:pos="720"/>
+        </w:tabs>
+        <w:ind w:left="720" w:hanging="360"/>
+      </w:pPr>
+      <w:rPr>
+        <w:rFonts w:ascii="Symbol" w:hAnsi="Symbol" w:hint="default"/>
+        <w:sz w:val="20"/>
+      </w:rPr>
+    </w:lvl>
+    <w:lvl w:ilvl="1" w:tentative="1">
+      <w:start w:val="1"/>
+      <w:numFmt w:val="bullet"/>
+      <w:lvlText w:val="o"/>
+      <w:lvlJc w:val="left"/>
+      <w:pPr>
+        <w:tabs>
+          <w:tab w:val="num" w:pos="1440"/>
+        </w:tabs>
+        <w:ind w:left="1440" w:hanging="360"/>
+      </w:pPr>
+      <w:rPr>
+        <w:rFonts w:ascii="Courier New" w:hAnsi="Courier New" w:hint="default"/>
+        <w:sz w:val="20"/>
+      </w:rPr>
+    </w:lvl>
+    <w:lvl w:ilvl="2" w:tentative="1">
+      <w:start w:val="1"/>
+      <w:numFmt w:val="bullet"/>
+      <w:lvlText w:val=""/>
+      <w:lvlJc w:val="left"/>
+      <w:pPr>
+        <w:tabs>
+          <w:tab w:val="num" w:pos="2160"/>
+        </w:tabs>
+        <w:ind w:left="2160" w:hanging="360"/>
+      </w:pPr>
+      <w:rPr>
+        <w:rFonts w:ascii="Wingdings" w:hAnsi="Wingdings" w:hint="default"/>
+        <w:sz w:val="20"/>
+      </w:rPr>
+    </w:lvl>
+    <w:lvl w:ilvl="3" w:tentative="1">
+      <w:start w:val="1"/>
+      <w:numFmt w:val="bullet"/>
+      <w:lvlText w:val=""/>
+      <w:lvlJc w:val="left"/>
+      <w:pPr>
+        <w:tabs>
+          <w:tab w:val="num" w:pos="2880"/>
+        </w:tabs>
+        <w:ind w:left="2880" w:hanging="360"/>
+      </w:pPr>
+      <w:rPr>
+        <w:rFonts w:ascii="Wingdings" w:hAnsi="Wingdings" w:hint="default"/>
+        <w:sz w:val="20"/>
+      </w:rPr>
+    </w:lvl>
+    <w:lvl w:ilvl="4" w:tentative="1">
+      <w:start w:val="1"/>
+      <w:numFmt w:val="bullet"/>
+      <w:lvlText w:val=""/>
+      <w:lvlJc w:val="left"/>
+      <w:pPr>
+        <w:tabs>
+          <w:tab w:val="num" w:pos="3600"/>
+        </w:tabs>
+        <w:ind w:left="3600" w:hanging="360"/>
+      </w:pPr>
+      <w:rPr>
+        <w:rFonts w:ascii="Wingdings" w:hAnsi="Wingdings" w:hint="default"/>
+        <w:sz w:val="20"/>
+      </w:rPr>
+    </w:lvl>
+    <w:lvl w:ilvl="5" w:tentative="1">
+      <w:start w:val="1"/>
+      <w:numFmt w:val="bullet"/>
+      <w:lvlText w:val=""/>
+      <w:lvlJc w:val="left"/>
+      <w:pPr>
+        <w:tabs>
+          <w:tab w:val="num" w:pos="4320"/>
+        </w:tabs>
+        <w:ind w:left="4320" w:hanging="360"/>
+      </w:pPr>
+      <w:rPr>
+        <w:rFonts w:ascii="Wingdings" w:hAnsi="Wingdings" w:hint="default"/>
+        <w:sz w:val="20"/>
+      </w:rPr>
+    </w:lvl>
+    <w:lvl w:ilvl="6" w:tentative="1">
+      <w:start w:val="1"/>
+      <w:numFmt w:val="bullet"/>
+      <w:lvlText w:val=""/>
+      <w:lvlJc w:val="left"/>
+      <w:pPr>
+        <w:tabs>
+          <w:tab w:val="num" w:pos="5040"/>
+        </w:tabs>
+        <w:ind w:left="5040" w:hanging="360"/>
+      </w:pPr>
+      <w:rPr>
+        <w:rFonts w:ascii="Wingdings" w:hAnsi="Wingdings" w:hint="default"/>
+        <w:sz w:val="20"/>
+      </w:rPr>
+    </w:lvl>
+    <w:lvl w:ilvl="7" w:tentative="1">
+      <w:start w:val="1"/>
+      <w:numFmt w:val="bullet"/>
+      <w:lvlText w:val=""/>
+      <w:lvlJc w:val="left"/>
+      <w:pPr>
+        <w:tabs>
+          <w:tab w:val="num" w:pos="5760"/>
+        </w:tabs>
+        <w:ind w:left="5760" w:hanging="360"/>
+      </w:pPr>
+      <w:rPr>
+        <w:rFonts w:ascii="Wingdings" w:hAnsi="Wingdings" w:hint="default"/>
+        <w:sz w:val="20"/>
+      </w:rPr>
+    </w:lvl>
+    <w:lvl w:ilvl="8" w:tentative="1">
+      <w:start w:val="1"/>
+      <w:numFmt w:val="bullet"/>
+      <w:lvlText w:val=""/>
+      <w:lvlJc w:val="left"/>
+      <w:pPr>
+        <w:tabs>
+          <w:tab w:val="num" w:pos="6480"/>
+        </w:tabs>
+        <w:ind w:left="6480" w:hanging="360"/>
+      </w:pPr>
+      <w:rPr>
+        <w:rFonts w:ascii="Wingdings" w:hAnsi="Wingdings" w:hint="default"/>
+        <w:sz w:val="20"/>
+      </w:rPr>
+    </w:lvl>
+  </w:abstractNum>
+  <w:abstractNum w:abstractNumId="2" w15:restartNumberingAfterBreak="0">
+    <w:nsid w:val="0FF01BEC"/>
+    <w:multiLevelType w:val="multilevel"/>
+    <w:tmpl w:val="EB663008"/>
+    <w:lvl w:ilvl="0">
+      <w:start w:val="1"/>
+      <w:numFmt w:val="bullet"/>
+      <w:lvlText w:val=""/>
+      <w:lvlJc w:val="left"/>
+      <w:pPr>
+        <w:tabs>
+          <w:tab w:val="num" w:pos="720"/>
+        </w:tabs>
+        <w:ind w:left="720" w:hanging="360"/>
+      </w:pPr>
+      <w:rPr>
+        <w:rFonts w:ascii="Symbol" w:hAnsi="Symbol" w:hint="default"/>
+        <w:sz w:val="20"/>
+      </w:rPr>
+    </w:lvl>
+    <w:lvl w:ilvl="1" w:tentative="1">
+      <w:start w:val="1"/>
+      <w:numFmt w:val="bullet"/>
+      <w:lvlText w:val="o"/>
+      <w:lvlJc w:val="left"/>
+      <w:pPr>
+        <w:tabs>
+          <w:tab w:val="num" w:pos="1440"/>
+        </w:tabs>
+        <w:ind w:left="1440" w:hanging="360"/>
+      </w:pPr>
+      <w:rPr>
+        <w:rFonts w:ascii="Courier New" w:hAnsi="Courier New" w:hint="default"/>
+        <w:sz w:val="20"/>
+      </w:rPr>
+    </w:lvl>
+    <w:lvl w:ilvl="2" w:tentative="1">
+      <w:start w:val="1"/>
+      <w:numFmt w:val="bullet"/>
+      <w:lvlText w:val=""/>
+      <w:lvlJc w:val="left"/>
+      <w:pPr>
+        <w:tabs>
+          <w:tab w:val="num" w:pos="2160"/>
+        </w:tabs>
+        <w:ind w:left="2160" w:hanging="360"/>
+      </w:pPr>
+      <w:rPr>
+        <w:rFonts w:ascii="Wingdings" w:hAnsi="Wingdings" w:hint="default"/>
+        <w:sz w:val="20"/>
+      </w:rPr>
+    </w:lvl>
+    <w:lvl w:ilvl="3" w:tentative="1">
+      <w:start w:val="1"/>
+      <w:numFmt w:val="bullet"/>
+      <w:lvlText w:val=""/>
+      <w:lvlJc w:val="left"/>
+      <w:pPr>
+        <w:tabs>
+          <w:tab w:val="num" w:pos="2880"/>
+        </w:tabs>
+        <w:ind w:left="2880" w:hanging="360"/>
+      </w:pPr>
+      <w:rPr>
+        <w:rFonts w:ascii="Wingdings" w:hAnsi="Wingdings" w:hint="default"/>
+        <w:sz w:val="20"/>
+      </w:rPr>
+    </w:lvl>
+    <w:lvl w:ilvl="4" w:tentative="1">
+      <w:start w:val="1"/>
+      <w:numFmt w:val="bullet"/>
+      <w:lvlText w:val=""/>
+      <w:lvlJc w:val="left"/>
+      <w:pPr>
+        <w:tabs>
+          <w:tab w:val="num" w:pos="3600"/>
+        </w:tabs>
+        <w:ind w:left="3600" w:hanging="360"/>
+      </w:pPr>
+      <w:rPr>
+        <w:rFonts w:ascii="Wingdings" w:hAnsi="Wingdings" w:hint="default"/>
+        <w:sz w:val="20"/>
+      </w:rPr>
+    </w:lvl>
+    <w:lvl w:ilvl="5" w:tentative="1">
+      <w:start w:val="1"/>
+      <w:numFmt w:val="bullet"/>
+      <w:lvlText w:val=""/>
+      <w:lvlJc w:val="left"/>
+      <w:pPr>
+        <w:tabs>
+          <w:tab w:val="num" w:pos="4320"/>
+        </w:tabs>
+        <w:ind w:left="4320" w:hanging="360"/>
+      </w:pPr>
+      <w:rPr>
+        <w:rFonts w:ascii="Wingdings" w:hAnsi="Wingdings" w:hint="default"/>
+        <w:sz w:val="20"/>
+      </w:rPr>
+    </w:lvl>
+    <w:lvl w:ilvl="6" w:tentative="1">
+      <w:start w:val="1"/>
+      <w:numFmt w:val="bullet"/>
+      <w:lvlText w:val=""/>
+      <w:lvlJc w:val="left"/>
+      <w:pPr>
+        <w:tabs>
+          <w:tab w:val="num" w:pos="5040"/>
+        </w:tabs>
+        <w:ind w:left="5040" w:hanging="360"/>
+      </w:pPr>
+      <w:rPr>
+        <w:rFonts w:ascii="Wingdings" w:hAnsi="Wingdings" w:hint="default"/>
+        <w:sz w:val="20"/>
+      </w:rPr>
+    </w:lvl>
+    <w:lvl w:ilvl="7" w:tentative="1">
+      <w:start w:val="1"/>
+      <w:numFmt w:val="bullet"/>
+      <w:lvlText w:val=""/>
+      <w:lvlJc w:val="left"/>
+      <w:pPr>
+        <w:tabs>
+          <w:tab w:val="num" w:pos="5760"/>
+        </w:tabs>
+        <w:ind w:left="5760" w:hanging="360"/>
+      </w:pPr>
+      <w:rPr>
+        <w:rFonts w:ascii="Wingdings" w:hAnsi="Wingdings" w:hint="default"/>
+        <w:sz w:val="20"/>
+      </w:rPr>
+    </w:lvl>
+    <w:lvl w:ilvl="8" w:tentative="1">
+      <w:start w:val="1"/>
+      <w:numFmt w:val="bullet"/>
+      <w:lvlText w:val=""/>
+      <w:lvlJc w:val="left"/>
+      <w:pPr>
+        <w:tabs>
+          <w:tab w:val="num" w:pos="6480"/>
+        </w:tabs>
+        <w:ind w:left="6480" w:hanging="360"/>
+      </w:pPr>
+      <w:rPr>
+        <w:rFonts w:ascii="Wingdings" w:hAnsi="Wingdings" w:hint="default"/>
+        <w:sz w:val="20"/>
+      </w:rPr>
+    </w:lvl>
+  </w:abstractNum>
+  <w:abstractNum w:abstractNumId="3" w15:restartNumberingAfterBreak="0">
+    <w:nsid w:val="14CC1A1D"/>
+    <w:multiLevelType w:val="multilevel"/>
+    <w:tmpl w:val="1794FCEE"/>
+    <w:lvl w:ilvl="0">
+      <w:start w:val="1"/>
+      <w:numFmt w:val="bullet"/>
+      <w:lvlText w:val=""/>
+      <w:lvlJc w:val="left"/>
+      <w:pPr>
+        <w:tabs>
+          <w:tab w:val="num" w:pos="720"/>
+        </w:tabs>
+        <w:ind w:left="720" w:hanging="360"/>
+      </w:pPr>
+      <w:rPr>
+        <w:rFonts w:ascii="Symbol" w:hAnsi="Symbol" w:hint="default"/>
+        <w:sz w:val="20"/>
+      </w:rPr>
+    </w:lvl>
+    <w:lvl w:ilvl="1" w:tentative="1">
+      <w:start w:val="1"/>
+      <w:numFmt w:val="bullet"/>
+      <w:lvlText w:val="o"/>
+      <w:lvlJc w:val="left"/>
+      <w:pPr>
+        <w:tabs>
+          <w:tab w:val="num" w:pos="1440"/>
+        </w:tabs>
+        <w:ind w:left="1440" w:hanging="360"/>
+      </w:pPr>
+      <w:rPr>
+        <w:rFonts w:ascii="Courier New" w:hAnsi="Courier New" w:hint="default"/>
+        <w:sz w:val="20"/>
+      </w:rPr>
+    </w:lvl>
+    <w:lvl w:ilvl="2" w:tentative="1">
+      <w:start w:val="1"/>
+      <w:numFmt w:val="bullet"/>
+      <w:lvlText w:val=""/>
+      <w:lvlJc w:val="left"/>
+      <w:pPr>
+        <w:tabs>
+          <w:tab w:val="num" w:pos="2160"/>
+        </w:tabs>
+        <w:ind w:left="2160" w:hanging="360"/>
+      </w:pPr>
+      <w:rPr>
+        <w:rFonts w:ascii="Wingdings" w:hAnsi="Wingdings" w:hint="default"/>
+        <w:sz w:val="20"/>
+      </w:rPr>
+    </w:lvl>
+    <w:lvl w:ilvl="3" w:tentative="1">
+      <w:start w:val="1"/>
+      <w:numFmt w:val="bullet"/>
+      <w:lvlText w:val=""/>
+      <w:lvlJc w:val="left"/>
+      <w:pPr>
+        <w:tabs>
+          <w:tab w:val="num" w:pos="2880"/>
+        </w:tabs>
+        <w:ind w:left="2880" w:hanging="360"/>
+      </w:pPr>
+      <w:rPr>
+        <w:rFonts w:ascii="Wingdings" w:hAnsi="Wingdings" w:hint="default"/>
+        <w:sz w:val="20"/>
+      </w:rPr>
+    </w:lvl>
+    <w:lvl w:ilvl="4" w:tentative="1">
+      <w:start w:val="1"/>
+      <w:numFmt w:val="bullet"/>
+      <w:lvlText w:val=""/>
+      <w:lvlJc w:val="left"/>
+      <w:pPr>
+        <w:tabs>
+          <w:tab w:val="num" w:pos="3600"/>
+        </w:tabs>
+        <w:ind w:left="3600" w:hanging="360"/>
+      </w:pPr>
+      <w:rPr>
+        <w:rFonts w:ascii="Wingdings" w:hAnsi="Wingdings" w:hint="default"/>
+        <w:sz w:val="20"/>
+      </w:rPr>
+    </w:lvl>
+    <w:lvl w:ilvl="5" w:tentative="1">
+      <w:start w:val="1"/>
+      <w:numFmt w:val="bullet"/>
+      <w:lvlText w:val=""/>
+      <w:lvlJc w:val="left"/>
+      <w:pPr>
+        <w:tabs>
+          <w:tab w:val="num" w:pos="4320"/>
+        </w:tabs>
+        <w:ind w:left="4320" w:hanging="360"/>
+      </w:pPr>
+      <w:rPr>
+        <w:rFonts w:ascii="Wingdings" w:hAnsi="Wingdings" w:hint="default"/>
+        <w:sz w:val="20"/>
+      </w:rPr>
+    </w:lvl>
+    <w:lvl w:ilvl="6" w:tentative="1">
+      <w:start w:val="1"/>
+      <w:numFmt w:val="bullet"/>
+      <w:lvlText w:val=""/>
+      <w:lvlJc w:val="left"/>
+      <w:pPr>
+        <w:tabs>
+          <w:tab w:val="num" w:pos="5040"/>
+        </w:tabs>
+        <w:ind w:left="5040" w:hanging="360"/>
+      </w:pPr>
+      <w:rPr>
+        <w:rFonts w:ascii="Wingdings" w:hAnsi="Wingdings" w:hint="default"/>
+        <w:sz w:val="20"/>
+      </w:rPr>
+    </w:lvl>
+    <w:lvl w:ilvl="7" w:tentative="1">
+      <w:start w:val="1"/>
+      <w:numFmt w:val="bullet"/>
+      <w:lvlText w:val=""/>
+      <w:lvlJc w:val="left"/>
+      <w:pPr>
+        <w:tabs>
+          <w:tab w:val="num" w:pos="5760"/>
+        </w:tabs>
+        <w:ind w:left="5760" w:hanging="360"/>
+      </w:pPr>
+      <w:rPr>
+        <w:rFonts w:ascii="Wingdings" w:hAnsi="Wingdings" w:hint="default"/>
+        <w:sz w:val="20"/>
+      </w:rPr>
+    </w:lvl>
+    <w:lvl w:ilvl="8" w:tentative="1">
+      <w:start w:val="1"/>
+      <w:numFmt w:val="bullet"/>
+      <w:lvlText w:val=""/>
+      <w:lvlJc w:val="left"/>
+      <w:pPr>
+        <w:tabs>
+          <w:tab w:val="num" w:pos="6480"/>
+        </w:tabs>
+        <w:ind w:left="6480" w:hanging="360"/>
+      </w:pPr>
+      <w:rPr>
+        <w:rFonts w:ascii="Wingdings" w:hAnsi="Wingdings" w:hint="default"/>
+        <w:sz w:val="20"/>
+      </w:rPr>
+    </w:lvl>
+  </w:abstractNum>
+  <w:abstractNum w:abstractNumId="4" w15:restartNumberingAfterBreak="0">
+    <w:nsid w:val="18367AA5"/>
+    <w:multiLevelType w:val="multilevel"/>
+    <w:tmpl w:val="30A6CD86"/>
+    <w:lvl w:ilvl="0">
+      <w:start w:val="1"/>
+      <w:numFmt w:val="decimal"/>
+      <w:suff w:val="space"/>
+      <w:lvlText w:val="%1."/>
+      <w:lvlJc w:val="left"/>
+      <w:pPr>
+        <w:ind w:left="0" w:firstLine="0"/>
+      </w:pPr>
+      <w:rPr>
+        <w:rFonts w:hint="default"/>
+      </w:rPr>
+    </w:lvl>
+    <w:lvl w:ilvl="1">
+      <w:start w:val="1"/>
+      <w:numFmt w:val="lowerLetter"/>
+      <w:lvlText w:val="%2."/>
+      <w:lvlJc w:val="left"/>
+      <w:pPr>
+        <w:ind w:left="0" w:firstLine="0"/>
+      </w:pPr>
+      <w:rPr>
+        <w:rFonts w:hint="default"/>
+      </w:rPr>
+    </w:lvl>
+    <w:lvl w:ilvl="2">
+      <w:start w:val="1"/>
+      <w:numFmt w:val="lowerRoman"/>
+      <w:lvlText w:val="%3."/>
+      <w:lvlJc w:val="right"/>
+      <w:pPr>
+        <w:ind w:left="0" w:firstLine="0"/>
+      </w:pPr>
+      <w:rPr>
+        <w:rFonts w:hint="default"/>
+      </w:rPr>
+    </w:lvl>
+    <w:lvl w:ilvl="3">
+      <w:start w:val="1"/>
+      <w:numFmt w:val="decimal"/>
+      <w:lvlText w:val="%4."/>
+      <w:lvlJc w:val="left"/>
+      <w:pPr>
+        <w:ind w:left="0" w:firstLine="0"/>
+      </w:pPr>
+      <w:rPr>
+        <w:rFonts w:hint="default"/>
+      </w:rPr>
+    </w:lvl>
+    <w:lvl w:ilvl="4">
+      <w:start w:val="1"/>
+      <w:numFmt w:val="lowerLetter"/>
+      <w:lvlText w:val="%5."/>
+      <w:lvlJc w:val="left"/>
+      <w:pPr>
+        <w:ind w:left="0" w:firstLine="0"/>
+      </w:pPr>
+      <w:rPr>
+        <w:rFonts w:hint="default"/>
+      </w:rPr>
+    </w:lvl>
+    <w:lvl w:ilvl="5">
+      <w:start w:val="1"/>
+      <w:numFmt w:val="lowerRoman"/>
+      <w:lvlText w:val="%6."/>
+      <w:lvlJc w:val="right"/>
+      <w:pPr>
+        <w:ind w:left="0" w:firstLine="0"/>
+      </w:pPr>
+      <w:rPr>
+        <w:rFonts w:hint="default"/>
+      </w:rPr>
+    </w:lvl>
+    <w:lvl w:ilvl="6">
+      <w:start w:val="1"/>
+      <w:numFmt w:val="decimal"/>
+      <w:lvlText w:val="%7."/>
+      <w:lvlJc w:val="left"/>
+      <w:pPr>
+        <w:ind w:left="0" w:firstLine="0"/>
+      </w:pPr>
+      <w:rPr>
+        <w:rFonts w:hint="default"/>
+      </w:rPr>
+    </w:lvl>
+    <w:lvl w:ilvl="7">
+      <w:start w:val="1"/>
+      <w:numFmt w:val="lowerLetter"/>
+      <w:lvlText w:val="%8."/>
+      <w:lvlJc w:val="left"/>
+      <w:pPr>
+        <w:ind w:left="0" w:firstLine="0"/>
+      </w:pPr>
+      <w:rPr>
+        <w:rFonts w:hint="default"/>
+      </w:rPr>
+    </w:lvl>
+    <w:lvl w:ilvl="8">
+      <w:start w:val="1"/>
+      <w:numFmt w:val="lowerRoman"/>
+      <w:lvlText w:val="%9."/>
+      <w:lvlJc w:val="right"/>
+      <w:pPr>
+        <w:ind w:left="0" w:firstLine="0"/>
+      </w:pPr>
+      <w:rPr>
+        <w:rFonts w:hint="default"/>
+      </w:rPr>
+    </w:lvl>
+  </w:abstractNum>
+  <w:abstractNum w:abstractNumId="5" w15:restartNumberingAfterBreak="0">
+    <w:nsid w:val="23702A30"/>
+    <w:multiLevelType w:val="multilevel"/>
+    <w:tmpl w:val="5A3E5316"/>
+    <w:lvl w:ilvl="0">
+      <w:start w:val="1"/>
+      <w:numFmt w:val="bullet"/>
+      <w:lvlText w:val=""/>
+      <w:lvlJc w:val="left"/>
+      <w:pPr>
+        <w:tabs>
+          <w:tab w:val="num" w:pos="720"/>
+        </w:tabs>
+        <w:ind w:left="720" w:hanging="360"/>
+      </w:pPr>
+      <w:rPr>
+        <w:rFonts w:ascii="Symbol" w:hAnsi="Symbol" w:hint="default"/>
+        <w:sz w:val="20"/>
+      </w:rPr>
+    </w:lvl>
+    <w:lvl w:ilvl="1" w:tentative="1">
+      <w:start w:val="1"/>
+      <w:numFmt w:val="bullet"/>
+      <w:lvlText w:val="o"/>
+      <w:lvlJc w:val="left"/>
+      <w:pPr>
+        <w:tabs>
+          <w:tab w:val="num" w:pos="1440"/>
+        </w:tabs>
+        <w:ind w:left="1440" w:hanging="360"/>
+      </w:pPr>
+      <w:rPr>
+        <w:rFonts w:ascii="Courier New" w:hAnsi="Courier New" w:hint="default"/>
+        <w:sz w:val="20"/>
+      </w:rPr>
+    </w:lvl>
+    <w:lvl w:ilvl="2" w:tentative="1">
+      <w:start w:val="1"/>
+      <w:numFmt w:val="bullet"/>
+      <w:lvlText w:val=""/>
+      <w:lvlJc w:val="left"/>
+      <w:pPr>
+        <w:tabs>
+          <w:tab w:val="num" w:pos="2160"/>
+        </w:tabs>
+        <w:ind w:left="2160" w:hanging="360"/>
+      </w:pPr>
+      <w:rPr>
+        <w:rFonts w:ascii="Wingdings" w:hAnsi="Wingdings" w:hint="default"/>
+        <w:sz w:val="20"/>
+      </w:rPr>
+    </w:lvl>
+    <w:lvl w:ilvl="3" w:tentative="1">
+      <w:start w:val="1"/>
+      <w:numFmt w:val="bullet"/>
+      <w:lvlText w:val=""/>
+      <w:lvlJc w:val="left"/>
+      <w:pPr>
+        <w:tabs>
+          <w:tab w:val="num" w:pos="2880"/>
+        </w:tabs>
+        <w:ind w:left="2880" w:hanging="360"/>
+      </w:pPr>
+      <w:rPr>
+        <w:rFonts w:ascii="Wingdings" w:hAnsi="Wingdings" w:hint="default"/>
+        <w:sz w:val="20"/>
+      </w:rPr>
+    </w:lvl>
+    <w:lvl w:ilvl="4" w:tentative="1">
+      <w:start w:val="1"/>
+      <w:numFmt w:val="bullet"/>
+      <w:lvlText w:val=""/>
+      <w:lvlJc w:val="left"/>
+      <w:pPr>
+        <w:tabs>
+          <w:tab w:val="num" w:pos="3600"/>
+        </w:tabs>
+        <w:ind w:left="3600" w:hanging="360"/>
+      </w:pPr>
+      <w:rPr>
+        <w:rFonts w:ascii="Wingdings" w:hAnsi="Wingdings" w:hint="default"/>
+        <w:sz w:val="20"/>
+      </w:rPr>
+    </w:lvl>
+    <w:lvl w:ilvl="5" w:tentative="1">
+      <w:start w:val="1"/>
+      <w:numFmt w:val="bullet"/>
+      <w:lvlText w:val=""/>
+      <w:lvlJc w:val="left"/>
+      <w:pPr>
+        <w:tabs>
+          <w:tab w:val="num" w:pos="4320"/>
+        </w:tabs>
+        <w:ind w:left="4320" w:hanging="360"/>
+      </w:pPr>
+      <w:rPr>
+        <w:rFonts w:ascii="Wingdings" w:hAnsi="Wingdings" w:hint="default"/>
+        <w:sz w:val="20"/>
+      </w:rPr>
+    </w:lvl>
+    <w:lvl w:ilvl="6" w:tentative="1">
+      <w:start w:val="1"/>
+      <w:numFmt w:val="bullet"/>
+      <w:lvlText w:val=""/>
+      <w:lvlJc w:val="left"/>
+      <w:pPr>
+        <w:tabs>
+          <w:tab w:val="num" w:pos="5040"/>
+        </w:tabs>
+        <w:ind w:left="5040" w:hanging="360"/>
+      </w:pPr>
+      <w:rPr>
+        <w:rFonts w:ascii="Wingdings" w:hAnsi="Wingdings" w:hint="default"/>
+        <w:sz w:val="20"/>
+      </w:rPr>
+    </w:lvl>
+    <w:lvl w:ilvl="7" w:tentative="1">
+      <w:start w:val="1"/>
+      <w:numFmt w:val="bullet"/>
+      <w:lvlText w:val=""/>
+      <w:lvlJc w:val="left"/>
+      <w:pPr>
+        <w:tabs>
+          <w:tab w:val="num" w:pos="5760"/>
+        </w:tabs>
+        <w:ind w:left="5760" w:hanging="360"/>
+      </w:pPr>
+      <w:rPr>
+        <w:rFonts w:ascii="Wingdings" w:hAnsi="Wingdings" w:hint="default"/>
+        <w:sz w:val="20"/>
+      </w:rPr>
+    </w:lvl>
+    <w:lvl w:ilvl="8" w:tentative="1">
+      <w:start w:val="1"/>
+      <w:numFmt w:val="bullet"/>
+      <w:lvlText w:val=""/>
+      <w:lvlJc w:val="left"/>
+      <w:pPr>
+        <w:tabs>
+          <w:tab w:val="num" w:pos="6480"/>
+        </w:tabs>
+        <w:ind w:left="6480" w:hanging="360"/>
+      </w:pPr>
+      <w:rPr>
+        <w:rFonts w:ascii="Wingdings" w:hAnsi="Wingdings" w:hint="default"/>
+        <w:sz w:val="20"/>
+      </w:rPr>
+    </w:lvl>
+  </w:abstractNum>
+  <w:abstractNum w:abstractNumId="6" w15:restartNumberingAfterBreak="0">
+    <w:nsid w:val="40651FFD"/>
+    <w:multiLevelType w:val="multilevel"/>
+    <w:tmpl w:val="BA640624"/>
+    <w:lvl w:ilvl="0">
+      <w:start w:val="1"/>
+      <w:numFmt w:val="bullet"/>
+      <w:lvlText w:val=""/>
+      <w:lvlJc w:val="left"/>
+      <w:pPr>
+        <w:tabs>
+          <w:tab w:val="num" w:pos="720"/>
+        </w:tabs>
+        <w:ind w:left="720" w:hanging="360"/>
+      </w:pPr>
+      <w:rPr>
+        <w:rFonts w:ascii="Symbol" w:hAnsi="Symbol" w:hint="default"/>
+        <w:sz w:val="20"/>
+      </w:rPr>
+    </w:lvl>
+    <w:lvl w:ilvl="1" w:tentative="1">
+      <w:start w:val="1"/>
+      <w:numFmt w:val="bullet"/>
+      <w:lvlText w:val="o"/>
+      <w:lvlJc w:val="left"/>
+      <w:pPr>
+        <w:tabs>
+          <w:tab w:val="num" w:pos="1440"/>
+        </w:tabs>
+        <w:ind w:left="1440" w:hanging="360"/>
+      </w:pPr>
+      <w:rPr>
+        <w:rFonts w:ascii="Courier New" w:hAnsi="Courier New" w:hint="default"/>
+        <w:sz w:val="20"/>
+      </w:rPr>
+    </w:lvl>
+    <w:lvl w:ilvl="2" w:tentative="1">
+      <w:start w:val="1"/>
+      <w:numFmt w:val="bullet"/>
+      <w:lvlText w:val=""/>
+      <w:lvlJc w:val="left"/>
+      <w:pPr>
+        <w:tabs>
+          <w:tab w:val="num" w:pos="2160"/>
+        </w:tabs>
+        <w:ind w:left="2160" w:hanging="360"/>
+      </w:pPr>
+      <w:rPr>
+        <w:rFonts w:ascii="Wingdings" w:hAnsi="Wingdings" w:hint="default"/>
+        <w:sz w:val="20"/>
+      </w:rPr>
+    </w:lvl>
+    <w:lvl w:ilvl="3" w:tentative="1">
+      <w:start w:val="1"/>
+      <w:numFmt w:val="bullet"/>
+      <w:lvlText w:val=""/>
+      <w:lvlJc w:val="left"/>
+      <w:pPr>
+        <w:tabs>
+          <w:tab w:val="num" w:pos="2880"/>
+        </w:tabs>
+        <w:ind w:left="2880" w:hanging="360"/>
+      </w:pPr>
+      <w:rPr>
+        <w:rFonts w:ascii="Wingdings" w:hAnsi="Wingdings" w:hint="default"/>
+        <w:sz w:val="20"/>
+      </w:rPr>
+    </w:lvl>
+    <w:lvl w:ilvl="4" w:tentative="1">
+      <w:start w:val="1"/>
+      <w:numFmt w:val="bullet"/>
+      <w:lvlText w:val=""/>
+      <w:lvlJc w:val="left"/>
+      <w:pPr>
+        <w:tabs>
+          <w:tab w:val="num" w:pos="3600"/>
+        </w:tabs>
+        <w:ind w:left="3600" w:hanging="360"/>
+      </w:pPr>
+      <w:rPr>
+        <w:rFonts w:ascii="Wingdings" w:hAnsi="Wingdings" w:hint="default"/>
+        <w:sz w:val="20"/>
+      </w:rPr>
+    </w:lvl>
+    <w:lvl w:ilvl="5" w:tentative="1">
+      <w:start w:val="1"/>
+      <w:numFmt w:val="bullet"/>
+      <w:lvlText w:val=""/>
+      <w:lvlJc w:val="left"/>
+      <w:pPr>
+        <w:tabs>
+          <w:tab w:val="num" w:pos="4320"/>
+        </w:tabs>
+        <w:ind w:left="4320" w:hanging="360"/>
+      </w:pPr>
+      <w:rPr>
+        <w:rFonts w:ascii="Wingdings" w:hAnsi="Wingdings" w:hint="default"/>
+        <w:sz w:val="20"/>
+      </w:rPr>
+    </w:lvl>
+    <w:lvl w:ilvl="6" w:tentative="1">
+      <w:start w:val="1"/>
+      <w:numFmt w:val="bullet"/>
+      <w:lvlText w:val=""/>
+      <w:lvlJc w:val="left"/>
+      <w:pPr>
+        <w:tabs>
+          <w:tab w:val="num" w:pos="5040"/>
+        </w:tabs>
+        <w:ind w:left="5040" w:hanging="360"/>
+      </w:pPr>
+      <w:rPr>
+        <w:rFonts w:ascii="Wingdings" w:hAnsi="Wingdings" w:hint="default"/>
+        <w:sz w:val="20"/>
+      </w:rPr>
+    </w:lvl>
+    <w:lvl w:ilvl="7" w:tentative="1">
+      <w:start w:val="1"/>
+      <w:numFmt w:val="bullet"/>
+      <w:lvlText w:val=""/>
+      <w:lvlJc w:val="left"/>
+      <w:pPr>
+        <w:tabs>
+          <w:tab w:val="num" w:pos="5760"/>
+        </w:tabs>
+        <w:ind w:left="5760" w:hanging="360"/>
+      </w:pPr>
+      <w:rPr>
+        <w:rFonts w:ascii="Wingdings" w:hAnsi="Wingdings" w:hint="default"/>
+        <w:sz w:val="20"/>
+      </w:rPr>
+    </w:lvl>
+    <w:lvl w:ilvl="8" w:tentative="1">
+      <w:start w:val="1"/>
+      <w:numFmt w:val="bullet"/>
+      <w:lvlText w:val=""/>
+      <w:lvlJc w:val="left"/>
+      <w:pPr>
+        <w:tabs>
+          <w:tab w:val="num" w:pos="6480"/>
+        </w:tabs>
+        <w:ind w:left="6480" w:hanging="360"/>
+      </w:pPr>
+      <w:rPr>
+        <w:rFonts w:ascii="Wingdings" w:hAnsi="Wingdings" w:hint="default"/>
+        <w:sz w:val="20"/>
+      </w:rPr>
+    </w:lvl>
+  </w:abstractNum>
+  <w:abstractNum w:abstractNumId="7" w15:restartNumberingAfterBreak="0">
+    <w:nsid w:val="56CC09DD"/>
+    <w:multiLevelType w:val="hybridMultilevel"/>
+    <w:tmpl w:val="63BCABBC"/>
+    <w:lvl w:ilvl="0" w:tplc="041F000F">
+      <w:start w:val="1"/>
+      <w:numFmt w:val="decimal"/>
+      <w:lvlText w:val="%1."/>
+      <w:lvlJc w:val="left"/>
+      <w:pPr>
+        <w:ind w:left="720" w:hanging="360"/>
+      </w:pPr>
+      <w:rPr>
+        <w:rFonts w:hint="default"/>
+      </w:rPr>
+    </w:lvl>
+    <w:lvl w:ilvl="1" w:tplc="041F0019" w:tentative="1">
+      <w:start w:val="1"/>
+      <w:numFmt w:val="lowerLetter"/>
+      <w:lvlText w:val="%2."/>
+      <w:lvlJc w:val="left"/>
+      <w:pPr>
+        <w:ind w:left="1440" w:hanging="360"/>
+      </w:pPr>
+    </w:lvl>
+    <w:lvl w:ilvl="2" w:tplc="041F001B" w:tentative="1">
+      <w:start w:val="1"/>
+      <w:numFmt w:val="lowerRoman"/>
+      <w:lvlText w:val="%3."/>
+      <w:lvlJc w:val="right"/>
+      <w:pPr>
+        <w:ind w:left="2160" w:hanging="180"/>
+      </w:pPr>
+    </w:lvl>
+    <w:lvl w:ilvl="3" w:tplc="041F000F" w:tentative="1">
+      <w:start w:val="1"/>
+      <w:numFmt w:val="decimal"/>
+      <w:lvlText w:val="%4."/>
+      <w:lvlJc w:val="left"/>
+      <w:pPr>
+        <w:ind w:left="2880" w:hanging="360"/>
+      </w:pPr>
+    </w:lvl>
+    <w:lvl w:ilvl="4" w:tplc="041F0019" w:tentative="1">
+      <w:start w:val="1"/>
+      <w:numFmt w:val="lowerLetter"/>
+      <w:lvlText w:val="%5."/>
+      <w:lvlJc w:val="left"/>
+      <w:pPr>
+        <w:ind w:left="3600" w:hanging="360"/>
+      </w:pPr>
+    </w:lvl>
+    <w:lvl w:ilvl="5" w:tplc="041F001B" w:tentative="1">
+      <w:start w:val="1"/>
+      <w:numFmt w:val="lowerRoman"/>
+      <w:lvlText w:val="%6."/>
+      <w:lvlJc w:val="right"/>
+      <w:pPr>
+        <w:ind w:left="4320" w:hanging="180"/>
+      </w:pPr>
+    </w:lvl>
+    <w:lvl w:ilvl="6" w:tplc="041F000F" w:tentative="1">
+      <w:start w:val="1"/>
+      <w:numFmt w:val="decimal"/>
+      <w:lvlText w:val="%7."/>
+      <w:lvlJc w:val="left"/>
+      <w:pPr>
+        <w:ind w:left="5040" w:hanging="360"/>
+      </w:pPr>
+    </w:lvl>
+    <w:lvl w:ilvl="7" w:tplc="041F0019" w:tentative="1">
+      <w:start w:val="1"/>
+      <w:numFmt w:val="lowerLetter"/>
+      <w:lvlText w:val="%8."/>
+      <w:lvlJc w:val="left"/>
+      <w:pPr>
+        <w:ind w:left="5760" w:hanging="360"/>
+      </w:pPr>
+    </w:lvl>
+    <w:lvl w:ilvl="8" w:tplc="041F001B" w:tentative="1">
+      <w:start w:val="1"/>
+      <w:numFmt w:val="lowerRoman"/>
+      <w:lvlText w:val="%9."/>
+      <w:lvlJc w:val="right"/>
+      <w:pPr>
+        <w:ind w:left="6480" w:hanging="180"/>
+      </w:pPr>
+    </w:lvl>
+  </w:abstractNum>
+  <w:abstractNum w:abstractNumId="8" w15:restartNumberingAfterBreak="0">
+    <w:nsid w:val="6D2E5B3F"/>
+    <w:multiLevelType w:val="multilevel"/>
+    <w:tmpl w:val="ADE4AAEE"/>
+    <w:lvl w:ilvl="0">
+      <w:start w:val="1"/>
+      <w:numFmt w:val="bullet"/>
+      <w:lvlText w:val=""/>
+      <w:lvlJc w:val="left"/>
+      <w:pPr>
+        <w:tabs>
+          <w:tab w:val="num" w:pos="720"/>
+        </w:tabs>
+        <w:ind w:left="720" w:hanging="360"/>
+      </w:pPr>
+      <w:rPr>
+        <w:rFonts w:ascii="Symbol" w:hAnsi="Symbol" w:hint="default"/>
+        <w:sz w:val="20"/>
+      </w:rPr>
+    </w:lvl>
+    <w:lvl w:ilvl="1" w:tentative="1">
+      <w:start w:val="1"/>
+      <w:numFmt w:val="bullet"/>
+      <w:lvlText w:val="o"/>
+      <w:lvlJc w:val="left"/>
+      <w:pPr>
+        <w:tabs>
+          <w:tab w:val="num" w:pos="1440"/>
+        </w:tabs>
+        <w:ind w:left="1440" w:hanging="360"/>
+      </w:pPr>
+      <w:rPr>
+        <w:rFonts w:ascii="Courier New" w:hAnsi="Courier New" w:hint="default"/>
+        <w:sz w:val="20"/>
+      </w:rPr>
+    </w:lvl>
+    <w:lvl w:ilvl="2" w:tentative="1">
+      <w:start w:val="1"/>
+      <w:numFmt w:val="bullet"/>
+      <w:lvlText w:val=""/>
+      <w:lvlJc w:val="left"/>
+      <w:pPr>
+        <w:tabs>
+          <w:tab w:val="num" w:pos="2160"/>
+        </w:tabs>
+        <w:ind w:left="2160" w:hanging="360"/>
+      </w:pPr>
+      <w:rPr>
+        <w:rFonts w:ascii="Wingdings" w:hAnsi="Wingdings" w:hint="default"/>
+        <w:sz w:val="20"/>
+      </w:rPr>
+    </w:lvl>
+    <w:lvl w:ilvl="3" w:tentative="1">
+      <w:start w:val="1"/>
+      <w:numFmt w:val="bullet"/>
+      <w:lvlText w:val=""/>
+      <w:lvlJc w:val="left"/>
+      <w:pPr>
+        <w:tabs>
+          <w:tab w:val="num" w:pos="2880"/>
+        </w:tabs>
+        <w:ind w:left="2880" w:hanging="360"/>
+      </w:pPr>
+      <w:rPr>
+        <w:rFonts w:ascii="Wingdings" w:hAnsi="Wingdings" w:hint="default"/>
+        <w:sz w:val="20"/>
+      </w:rPr>
+    </w:lvl>
+    <w:lvl w:ilvl="4" w:tentative="1">
+      <w:start w:val="1"/>
+      <w:numFmt w:val="bullet"/>
+      <w:lvlText w:val=""/>
+      <w:lvlJc w:val="left"/>
+      <w:pPr>
+        <w:tabs>
+          <w:tab w:val="num" w:pos="3600"/>
+        </w:tabs>
+        <w:ind w:left="3600" w:hanging="360"/>
+      </w:pPr>
+      <w:rPr>
+        <w:rFonts w:ascii="Wingdings" w:hAnsi="Wingdings" w:hint="default"/>
+        <w:sz w:val="20"/>
+      </w:rPr>
+    </w:lvl>
+    <w:lvl w:ilvl="5" w:tentative="1">
+      <w:start w:val="1"/>
+      <w:numFmt w:val="bullet"/>
+      <w:lvlText w:val=""/>
+      <w:lvlJc w:val="left"/>
+      <w:pPr>
+        <w:tabs>
+          <w:tab w:val="num" w:pos="4320"/>
+        </w:tabs>
+        <w:ind w:left="4320" w:hanging="360"/>
+      </w:pPr>
+      <w:rPr>
+        <w:rFonts w:ascii="Wingdings" w:hAnsi="Wingdings" w:hint="default"/>
+        <w:sz w:val="20"/>
+      </w:rPr>
+    </w:lvl>
+    <w:lvl w:ilvl="6" w:tentative="1">
+      <w:start w:val="1"/>
+      <w:numFmt w:val="bullet"/>
+      <w:lvlText w:val=""/>
+      <w:lvlJc w:val="left"/>
+      <w:pPr>
+        <w:tabs>
+          <w:tab w:val="num" w:pos="5040"/>
+        </w:tabs>
+        <w:ind w:left="5040" w:hanging="360"/>
+      </w:pPr>
+      <w:rPr>
+        <w:rFonts w:ascii="Wingdings" w:hAnsi="Wingdings" w:hint="default"/>
+        <w:sz w:val="20"/>
+      </w:rPr>
+    </w:lvl>
+    <w:lvl w:ilvl="7" w:tentative="1">
+      <w:start w:val="1"/>
+      <w:numFmt w:val="bullet"/>
+      <w:lvlText w:val=""/>
+      <w:lvlJc w:val="left"/>
+      <w:pPr>
+        <w:tabs>
+          <w:tab w:val="num" w:pos="5760"/>
+        </w:tabs>
+        <w:ind w:left="5760" w:hanging="360"/>
+      </w:pPr>
+      <w:rPr>
+        <w:rFonts w:ascii="Wingdings" w:hAnsi="Wingdings" w:hint="default"/>
+        <w:sz w:val="20"/>
+      </w:rPr>
+    </w:lvl>
+    <w:lvl w:ilvl="8" w:tentative="1">
+      <w:start w:val="1"/>
+      <w:numFmt w:val="bullet"/>
+      <w:lvlText w:val=""/>
+      <w:lvlJc w:val="left"/>
+      <w:pPr>
+        <w:tabs>
+          <w:tab w:val="num" w:pos="6480"/>
+        </w:tabs>
+        <w:ind w:left="6480" w:hanging="360"/>
+      </w:pPr>
+      <w:rPr>
+        <w:rFonts w:ascii="Wingdings" w:hAnsi="Wingdings" w:hint="default"/>
+        <w:sz w:val="20"/>
+      </w:rPr>
+    </w:lvl>
+  </w:abstractNum>
+  <w:abstractNum w:abstractNumId="9" w15:restartNumberingAfterBreak="0">
+    <w:nsid w:val="6EEB0B71"/>
+    <w:multiLevelType w:val="multilevel"/>
+    <w:tmpl w:val="1C846B94"/>
+    <w:lvl w:ilvl="0">
+      <w:start w:val="1"/>
+      <w:numFmt w:val="bullet"/>
+      <w:lvlText w:val=""/>
+      <w:lvlJc w:val="left"/>
+      <w:pPr>
+        <w:tabs>
+          <w:tab w:val="num" w:pos="720"/>
+        </w:tabs>
+        <w:ind w:left="720" w:hanging="360"/>
+      </w:pPr>
+      <w:rPr>
+        <w:rFonts w:ascii="Symbol" w:hAnsi="Symbol" w:hint="default"/>
+        <w:sz w:val="20"/>
+      </w:rPr>
+    </w:lvl>
+    <w:lvl w:ilvl="1" w:tentative="1">
+      <w:start w:val="1"/>
+      <w:numFmt w:val="bullet"/>
+      <w:lvlText w:val="o"/>
+      <w:lvlJc w:val="left"/>
+      <w:pPr>
+        <w:tabs>
+          <w:tab w:val="num" w:pos="1440"/>
+        </w:tabs>
+        <w:ind w:left="1440" w:hanging="360"/>
+      </w:pPr>
+      <w:rPr>
+        <w:rFonts w:ascii="Courier New" w:hAnsi="Courier New" w:hint="default"/>
+        <w:sz w:val="20"/>
+      </w:rPr>
+    </w:lvl>
+    <w:lvl w:ilvl="2" w:tentative="1">
+      <w:start w:val="1"/>
+      <w:numFmt w:val="bullet"/>
+      <w:lvlText w:val=""/>
+      <w:lvlJc w:val="left"/>
+      <w:pPr>
+        <w:tabs>
+          <w:tab w:val="num" w:pos="2160"/>
+        </w:tabs>
+        <w:ind w:left="2160" w:hanging="360"/>
+      </w:pPr>
+      <w:rPr>
+        <w:rFonts w:ascii="Wingdings" w:hAnsi="Wingdings" w:hint="default"/>
+        <w:sz w:val="20"/>
+      </w:rPr>
+    </w:lvl>
+    <w:lvl w:ilvl="3" w:tentative="1">
+      <w:start w:val="1"/>
+      <w:numFmt w:val="bullet"/>
+      <w:lvlText w:val=""/>
+      <w:lvlJc w:val="left"/>
+      <w:pPr>
+        <w:tabs>
+          <w:tab w:val="num" w:pos="2880"/>
+        </w:tabs>
+        <w:ind w:left="2880" w:hanging="360"/>
+      </w:pPr>
+      <w:rPr>
+        <w:rFonts w:ascii="Wingdings" w:hAnsi="Wingdings" w:hint="default"/>
+        <w:sz w:val="20"/>
+      </w:rPr>
+    </w:lvl>
+    <w:lvl w:ilvl="4" w:tentative="1">
+      <w:start w:val="1"/>
+      <w:numFmt w:val="bullet"/>
+      <w:lvlText w:val=""/>
+      <w:lvlJc w:val="left"/>
+      <w:pPr>
+        <w:tabs>
+          <w:tab w:val="num" w:pos="3600"/>
+        </w:tabs>
+        <w:ind w:left="3600" w:hanging="360"/>
+      </w:pPr>
+      <w:rPr>
+        <w:rFonts w:ascii="Wingdings" w:hAnsi="Wingdings" w:hint="default"/>
+        <w:sz w:val="20"/>
+      </w:rPr>
+    </w:lvl>
+    <w:lvl w:ilvl="5" w:tentative="1">
+      <w:start w:val="1"/>
+      <w:numFmt w:val="bullet"/>
+      <w:lvlText w:val=""/>
+      <w:lvlJc w:val="left"/>
+      <w:pPr>
+        <w:tabs>
+          <w:tab w:val="num" w:pos="4320"/>
+        </w:tabs>
+        <w:ind w:left="4320" w:hanging="360"/>
+      </w:pPr>
+      <w:rPr>
+        <w:rFonts w:ascii="Wingdings" w:hAnsi="Wingdings" w:hint="default"/>
+        <w:sz w:val="20"/>
+      </w:rPr>
+    </w:lvl>
+    <w:lvl w:ilvl="6" w:tentative="1">
+      <w:start w:val="1"/>
+      <w:numFmt w:val="bullet"/>
+      <w:lvlText w:val=""/>
+      <w:lvlJc w:val="left"/>
+      <w:pPr>
+        <w:tabs>
+          <w:tab w:val="num" w:pos="5040"/>
+        </w:tabs>
+        <w:ind w:left="5040" w:hanging="360"/>
+      </w:pPr>
+      <w:rPr>
+        <w:rFonts w:ascii="Wingdings" w:hAnsi="Wingdings" w:hint="default"/>
+        <w:sz w:val="20"/>
+      </w:rPr>
+    </w:lvl>
+    <w:lvl w:ilvl="7" w:tentative="1">
+      <w:start w:val="1"/>
+      <w:numFmt w:val="bullet"/>
+      <w:lvlText w:val=""/>
+      <w:lvlJc w:val="left"/>
+      <w:pPr>
+        <w:tabs>
+          <w:tab w:val="num" w:pos="5760"/>
+        </w:tabs>
+        <w:ind w:left="5760" w:hanging="360"/>
+      </w:pPr>
+      <w:rPr>
+        <w:rFonts w:ascii="Wingdings" w:hAnsi="Wingdings" w:hint="default"/>
+        <w:sz w:val="20"/>
+      </w:rPr>
+    </w:lvl>
+    <w:lvl w:ilvl="8" w:tentative="1">
+      <w:start w:val="1"/>
+      <w:numFmt w:val="bullet"/>
+      <w:lvlText w:val=""/>
+      <w:lvlJc w:val="left"/>
+      <w:pPr>
+        <w:tabs>
+          <w:tab w:val="num" w:pos="6480"/>
+        </w:tabs>
+        <w:ind w:left="6480" w:hanging="360"/>
+      </w:pPr>
+      <w:rPr>
+        <w:rFonts w:ascii="Wingdings" w:hAnsi="Wingdings" w:hint="default"/>
+        <w:sz w:val="20"/>
+      </w:rPr>
+    </w:lvl>
+  </w:abstractNum>
+  <w:num w:numId="1" w16cid:durableId="1048409110">
+    <w:abstractNumId w:val="0"/>
+  </w:num>
+  <w:num w:numId="2" w16cid:durableId="1847866107">
+    <w:abstractNumId w:val="6"/>
+  </w:num>
+  <w:num w:numId="3" w16cid:durableId="266278026">
+    <w:abstractNumId w:val="2"/>
+  </w:num>
+  <w:num w:numId="4" w16cid:durableId="1413551948">
+    <w:abstractNumId w:val="9"/>
+  </w:num>
+  <w:num w:numId="5" w16cid:durableId="2089426930">
+    <w:abstractNumId w:val="7"/>
+  </w:num>
+  <w:num w:numId="6" w16cid:durableId="2044674646">
+    <w:abstractNumId w:val="4"/>
+  </w:num>
+  <w:num w:numId="7" w16cid:durableId="2106026319">
+    <w:abstractNumId w:val="3"/>
+  </w:num>
+  <w:num w:numId="8" w16cid:durableId="1898278229">
+    <w:abstractNumId w:val="8"/>
+  </w:num>
+  <w:num w:numId="9" w16cid:durableId="1902591974">
+    <w:abstractNumId w:val="5"/>
+  </w:num>
+  <w:num w:numId="10" w16cid:durableId="929390984">
+    <w:abstractNumId w:val="1"/>
+  </w:num>
+</w:numbering>
 </file>
 
 <file path=word/styles.xml><?xml version="1.0" encoding="utf-8"?>
@@ -629,7 +2798,6 @@
   <w:style w:type="character" w:default="1" w:styleId="DefaultParagraphFont">
     <w:name w:val="Default Paragraph Font"/>
     <w:uiPriority w:val="1"/>
-    <w:semiHidden/>
     <w:unhideWhenUsed/>
   </w:style>
   <w:style w:type="table" w:default="1" w:styleId="TableNormal">
@@ -954,6 +3122,123 @@
       <w:color w:val="0F4761" w:themeColor="accent1" w:themeShade="BF"/>
       <w:spacing w:val="5"/>
     </w:rPr>
+  </w:style>
+  <w:style w:type="paragraph" w:styleId="NormalWeb">
+    <w:name w:val="Normal (Web)"/>
+    <w:basedOn w:val="Normal"/>
+    <w:uiPriority w:val="99"/>
+    <w:semiHidden/>
+    <w:unhideWhenUsed/>
+    <w:rsid w:val="0007699C"/>
+    <w:pPr>
+      <w:spacing w:before="100" w:beforeAutospacing="1" w:after="100" w:afterAutospacing="1"/>
+      <w:jc w:val="left"/>
+    </w:pPr>
+    <w:rPr>
+      <w:rFonts w:ascii="Times New Roman" w:eastAsia="Times New Roman" w:hAnsi="Times New Roman" w:cs="Times New Roman"/>
+      <w:kern w:val="0"/>
+      <w:sz w:val="24"/>
+      <w:lang w:eastAsia="tr-TR"/>
+      <w14:ligatures w14:val="none"/>
+    </w:rPr>
+  </w:style>
+  <w:style w:type="character" w:customStyle="1" w:styleId="whitespace-normal">
+    <w:name w:val="whitespace-normal"/>
+    <w:basedOn w:val="DefaultParagraphFont"/>
+    <w:rsid w:val="0007699C"/>
+  </w:style>
+  <w:style w:type="character" w:styleId="Strong">
+    <w:name w:val="Strong"/>
+    <w:basedOn w:val="DefaultParagraphFont"/>
+    <w:uiPriority w:val="22"/>
+    <w:qFormat/>
+    <w:rsid w:val="0007699C"/>
+    <w:rPr>
+      <w:b/>
+      <w:bCs/>
+    </w:rPr>
+  </w:style>
+  <w:style w:type="table" w:styleId="TableGrid">
+    <w:name w:val="Table Grid"/>
+    <w:basedOn w:val="TableNormal"/>
+    <w:uiPriority w:val="39"/>
+    <w:rsid w:val="007560C9"/>
+    <w:pPr>
+      <w:spacing w:after="0" w:line="240" w:lineRule="auto"/>
+    </w:pPr>
+    <w:tblPr>
+      <w:tblBorders>
+        <w:top w:val="single" w:sz="4" w:space="0" w:color="auto"/>
+        <w:left w:val="single" w:sz="4" w:space="0" w:color="auto"/>
+        <w:bottom w:val="single" w:sz="4" w:space="0" w:color="auto"/>
+        <w:right w:val="single" w:sz="4" w:space="0" w:color="auto"/>
+        <w:insideH w:val="single" w:sz="4" w:space="0" w:color="auto"/>
+        <w:insideV w:val="single" w:sz="4" w:space="0" w:color="auto"/>
+      </w:tblBorders>
+    </w:tblPr>
+  </w:style>
+  <w:style w:type="table" w:styleId="PlainTable1">
+    <w:name w:val="Plain Table 1"/>
+    <w:basedOn w:val="TableNormal"/>
+    <w:uiPriority w:val="41"/>
+    <w:rsid w:val="007560C9"/>
+    <w:pPr>
+      <w:spacing w:after="0" w:line="240" w:lineRule="auto"/>
+    </w:pPr>
+    <w:tblPr>
+      <w:tblStyleRowBandSize w:val="1"/>
+      <w:tblStyleColBandSize w:val="1"/>
+      <w:tblBorders>
+        <w:top w:val="single" w:sz="4" w:space="0" w:color="BFBFBF" w:themeColor="background1" w:themeShade="BF"/>
+        <w:left w:val="single" w:sz="4" w:space="0" w:color="BFBFBF" w:themeColor="background1" w:themeShade="BF"/>
+        <w:bottom w:val="single" w:sz="4" w:space="0" w:color="BFBFBF" w:themeColor="background1" w:themeShade="BF"/>
+        <w:right w:val="single" w:sz="4" w:space="0" w:color="BFBFBF" w:themeColor="background1" w:themeShade="BF"/>
+        <w:insideH w:val="single" w:sz="4" w:space="0" w:color="BFBFBF" w:themeColor="background1" w:themeShade="BF"/>
+        <w:insideV w:val="single" w:sz="4" w:space="0" w:color="BFBFBF" w:themeColor="background1" w:themeShade="BF"/>
+      </w:tblBorders>
+    </w:tblPr>
+    <w:tblStylePr w:type="firstRow">
+      <w:rPr>
+        <w:b/>
+        <w:bCs/>
+      </w:rPr>
+    </w:tblStylePr>
+    <w:tblStylePr w:type="lastRow">
+      <w:rPr>
+        <w:b/>
+        <w:bCs/>
+      </w:rPr>
+      <w:tblPr/>
+      <w:tcPr>
+        <w:tcBorders>
+          <w:top w:val="double" w:sz="4" w:space="0" w:color="BFBFBF" w:themeColor="background1" w:themeShade="BF"/>
+        </w:tcBorders>
+      </w:tcPr>
+    </w:tblStylePr>
+    <w:tblStylePr w:type="firstCol">
+      <w:rPr>
+        <w:b/>
+        <w:bCs/>
+      </w:rPr>
+    </w:tblStylePr>
+    <w:tblStylePr w:type="lastCol">
+      <w:rPr>
+        <w:b/>
+        <w:bCs/>
+      </w:rPr>
+    </w:tblStylePr>
+    <w:tblStylePr w:type="band1Vert">
+      <w:tblPr/>
+      <w:tcPr>
+        <w:shd w:val="clear" w:color="auto" w:fill="F2F2F2" w:themeFill="background1" w:themeFillShade="F2"/>
+      </w:tcPr>
+    </w:tblStylePr>
+    <w:tblStylePr w:type="band1Horz">
+      <w:tblPr/>
+      <w:tcPr>
+        <w:shd w:val="clear" w:color="auto" w:fill="F2F2F2" w:themeFill="background1" w:themeFillShade="F2"/>
+      </w:tcPr>
+    </w:tblStylePr>
   </w:style>
 </w:styles>
 </file>

</xml_diff>